<commit_message>
Please provide the changes or files you would like summarized so I can generate the appropriate commit message for you.
</commit_message>
<xml_diff>
--- a/docs/01_reports/Báo Cáo NghienData.docx
+++ b/docs/01_reports/Báo Cáo NghienData.docx
@@ -17761,38 +17761,17 @@
         <w:rPr>
           <w:rFonts w:ascii="Times New Roman" w:hAnsi="Times New Roman" w:cs="Times New Roman"/>
         </w:rPr>
+        <w:lastRenderedPageBreak/>
         <w:t>Chuyển đổi dữ liệu</w:t>
       </w:r>
       <w:bookmarkEnd w:id="33"/>
     </w:p>
     <w:p>
       <w:pPr>
-        <w:pStyle w:val="ListParagraph"/>
-        <w:numPr>
-          <w:ilvl w:val="0"/>
-          <w:numId w:val="2"/>
-        </w:numPr>
-        <w:rPr>
-          <w:rFonts w:cs="Times New Roman"/>
-          <w:i/>
-          <w:color w:val="00B050"/>
-        </w:rPr>
-      </w:pPr>
-      <w:r>
-        <w:rPr>
-          <w:rFonts w:cs="Times New Roman"/>
-          <w:i/>
-          <w:color w:val="00B050"/>
-        </w:rPr>
-        <w:t>Các trường hợp và kỹ thuật chuyển đổi dữ liệu</w:t>
-      </w:r>
-      <w:r>
-        <w:rPr>
-          <w:rFonts w:cs="Times New Roman"/>
-          <w:i/>
-          <w:color w:val="00B050"/>
-        </w:rPr>
-        <w:t>.</w:t>
+        <w:ind w:firstLine="720"/>
+      </w:pPr>
+      <w:r>
+        <w:t>Chuyển đổi dữ liệu là quá trình biến đổi dữ liệu từ định dạng, cấu trúc hoặc giá trị của nguồn ban đầu thành một dạng cấu trúc mới phù hợp cho việc phân tích, lưu trữ trong Data Warehouse và khai thác báo cáo BI.</w:t>
       </w:r>
     </w:p>
     <w:p>
@@ -17811,56 +17790,179 @@
         <w:rPr>
           <w:rFonts w:ascii="Times New Roman" w:hAnsi="Times New Roman" w:cs="Times New Roman"/>
         </w:rPr>
-        <w:lastRenderedPageBreak/>
         <w:t>Các trường hợp cần chuyển đổi</w:t>
       </w:r>
       <w:bookmarkEnd w:id="34"/>
     </w:p>
     <w:p>
       <w:pPr>
-        <w:pStyle w:val="ListParagraph"/>
+        <w:rPr>
+          <w:lang w:val="en-US"/>
+        </w:rPr>
+      </w:pPr>
+      <w:r>
+        <w:rPr>
+          <w:lang w:val="en-US"/>
+        </w:rPr>
+        <w:t>Trong dự án </w:t>
+      </w:r>
+      <w:r>
+        <w:rPr>
+          <w:b/>
+          <w:bCs/>
+          <w:lang w:val="en-US"/>
+        </w:rPr>
+        <w:t>Credit Risk</w:t>
+      </w:r>
+      <w:r>
+        <w:rPr>
+          <w:lang w:val="en-US"/>
+        </w:rPr>
+        <w:t>, dữ liệu thô ban đầu không thể đưa trực tiếp vào lưu trữ hay phân tích vì gặp phải các trường hợp bắt buộc phải chuyển đổi sau:</w:t>
+      </w:r>
+    </w:p>
+    <w:p>
+      <w:pPr>
         <w:numPr>
           <w:ilvl w:val="0"/>
-          <w:numId w:val="2"/>
-        </w:numPr>
-        <w:rPr>
-          <w:rFonts w:cs="Times New Roman"/>
-          <w:i/>
-          <w:color w:val="00B050"/>
-        </w:rPr>
-      </w:pPr>
-      <w:bookmarkStart w:id="35" w:name="_Hlk140242044"/>
-      <w:r>
-        <w:rPr>
-          <w:rFonts w:cs="Times New Roman"/>
-          <w:i/>
-          <w:color w:val="00B050"/>
-        </w:rPr>
-        <w:t xml:space="preserve">Nêu các trường hợp cần chuyển đổi dữ </w:t>
-      </w:r>
-      <w:bookmarkEnd w:id="35"/>
-      <w:r>
-        <w:rPr>
-          <w:rFonts w:cs="Times New Roman"/>
-          <w:i/>
-          <w:color w:val="00B050"/>
-        </w:rPr>
-        <w:t>liệu</w:t>
-      </w:r>
-    </w:p>
-    <w:p>
-      <w:pPr>
-        <w:jc w:val="left"/>
-        <w:rPr>
-          <w:rFonts w:cs="Times New Roman"/>
-        </w:rPr>
-      </w:pPr>
-      <w:r>
-        <w:rPr>
-          <w:rFonts w:cs="Times New Roman"/>
-          <w:highlight w:val="yellow"/>
-        </w:rPr>
-        <w:t>…</w:t>
+          <w:numId w:val="53"/>
+        </w:numPr>
+        <w:rPr>
+          <w:lang w:val="en-US"/>
+        </w:rPr>
+      </w:pPr>
+      <w:r>
+        <w:rPr>
+          <w:b/>
+          <w:bCs/>
+          <w:lang w:val="en-US"/>
+        </w:rPr>
+        <w:t>Khuyết thiếu thông tin có thể suy luận hoặc ước lượng:</w:t>
+      </w:r>
+    </w:p>
+    <w:p>
+      <w:pPr>
+        <w:numPr>
+          <w:ilvl w:val="1"/>
+          <w:numId w:val="53"/>
+        </w:numPr>
+        <w:rPr>
+          <w:lang w:val="en-US"/>
+        </w:rPr>
+      </w:pPr>
+      <w:r>
+        <w:rPr>
+          <w:lang w:val="en-US"/>
+        </w:rPr>
+        <w:t>Lãi suất khoản vay (loan_int_rate) hoặc số năm làm việc (person_emp_length) bị bỏ trống. Việc để trống sẽ làm hỏng các phân tích thống kê. Tuy nhiên, ngân hàng có thể chuyển đổi các ô trống này bằng cách ước lượng dựa trên các thuộc tính liên quan (như xếp hạng tín dụng hoặc độ tuổi).</w:t>
+      </w:r>
+    </w:p>
+    <w:p>
+      <w:pPr>
+        <w:numPr>
+          <w:ilvl w:val="0"/>
+          <w:numId w:val="53"/>
+        </w:numPr>
+        <w:rPr>
+          <w:lang w:val="en-US"/>
+        </w:rPr>
+      </w:pPr>
+      <w:r>
+        <w:rPr>
+          <w:b/>
+          <w:bCs/>
+          <w:lang w:val="en-US"/>
+        </w:rPr>
+        <w:t>Dữ liệu thô ở dạng bảng phẳng (Flat Table) cồng kềnh:</w:t>
+      </w:r>
+    </w:p>
+    <w:p>
+      <w:pPr>
+        <w:numPr>
+          <w:ilvl w:val="1"/>
+          <w:numId w:val="53"/>
+        </w:numPr>
+        <w:rPr>
+          <w:lang w:val="en-US"/>
+        </w:rPr>
+      </w:pPr>
+      <w:r>
+        <w:rPr>
+          <w:lang w:val="en-US"/>
+        </w:rPr>
+        <w:t>Tập dữ liệu nguồn chứa toàn bộ thông tin khách hàng, vị trí địa lý, xếp hạng tín dụng và thông tin khoản vay trên cùng một dòng. Nếu giữ nguyên cấu trúc này để lưu trữ sẽ làm lãng phí tài nguyên đĩa cứng và khiến các câu lệnh tính toán báo cáo BI bị chậm. Do đó, cần chuyển đổi cấu trúc sang mô hình hình sao (Star Schema).</w:t>
+      </w:r>
+    </w:p>
+    <w:p>
+      <w:pPr>
+        <w:numPr>
+          <w:ilvl w:val="0"/>
+          <w:numId w:val="53"/>
+        </w:numPr>
+        <w:rPr>
+          <w:lang w:val="en-US"/>
+        </w:rPr>
+      </w:pPr>
+      <w:r>
+        <w:rPr>
+          <w:b/>
+          <w:bCs/>
+          <w:lang w:val="en-US"/>
+        </w:rPr>
+        <w:t>Cần tạo thêm các cột thông tin mới (Derived Attributes):</w:t>
+      </w:r>
+    </w:p>
+    <w:p>
+      <w:pPr>
+        <w:numPr>
+          <w:ilvl w:val="1"/>
+          <w:numId w:val="53"/>
+        </w:numPr>
+        <w:rPr>
+          <w:lang w:val="en-US"/>
+        </w:rPr>
+      </w:pPr>
+      <w:r>
+        <w:rPr>
+          <w:lang w:val="en-US"/>
+        </w:rPr>
+        <w:t>Hệ thống cần thêm các cột phân tích như: cột status để theo dõi hồ sơ có bị dính cảnh báo chất lượng dữ liệu hay không, hoặc tính toán lại tỷ lệ nợ trên thu nhập thực tế dự phòng để đối chiếu chênh lệch.</w:t>
+      </w:r>
+    </w:p>
+    <w:p>
+      <w:pPr>
+        <w:numPr>
+          <w:ilvl w:val="0"/>
+          <w:numId w:val="53"/>
+        </w:numPr>
+        <w:rPr>
+          <w:lang w:val="en-US"/>
+        </w:rPr>
+      </w:pPr>
+      <w:r>
+        <w:rPr>
+          <w:b/>
+          <w:bCs/>
+          <w:lang w:val="en-US"/>
+        </w:rPr>
+        <w:t>Không tương thích định dạng file nguồn:</w:t>
+      </w:r>
+    </w:p>
+    <w:p>
+      <w:pPr>
+        <w:numPr>
+          <w:ilvl w:val="1"/>
+          <w:numId w:val="53"/>
+        </w:numPr>
+        <w:rPr>
+          <w:lang w:val="en-US"/>
+        </w:rPr>
+      </w:pPr>
+      <w:r>
+        <w:rPr>
+          <w:lang w:val="en-US"/>
+        </w:rPr>
+        <w:t>Dữ liệu thô lưu ở dạng file Excel .xls cần được chuyển đổi sang .csv để các thư viện lập trình của Python có thể xử lý song song với tốc độ cao hơn.</w:t>
       </w:r>
     </w:p>
     <w:p>
@@ -17874,80 +17976,305 @@
           <w:rFonts w:ascii="Times New Roman" w:hAnsi="Times New Roman" w:cs="Times New Roman"/>
         </w:rPr>
       </w:pPr>
-      <w:bookmarkStart w:id="36" w:name="_Toc232240923"/>
+      <w:bookmarkStart w:id="35" w:name="_Toc232240923"/>
       <w:r>
         <w:rPr>
           <w:rFonts w:ascii="Times New Roman" w:hAnsi="Times New Roman" w:cs="Times New Roman"/>
         </w:rPr>
         <w:t>Các kỹ thuật chuyển đổi</w:t>
       </w:r>
-      <w:bookmarkEnd w:id="36"/>
-    </w:p>
-    <w:p>
-      <w:pPr>
-        <w:pStyle w:val="ListParagraph"/>
+      <w:bookmarkEnd w:id="35"/>
+    </w:p>
+    <w:p>
+      <w:pPr>
+        <w:rPr>
+          <w:lang w:val="en-US"/>
+        </w:rPr>
+      </w:pPr>
+      <w:r>
+        <w:rPr>
+          <w:lang w:val="en-US"/>
+        </w:rPr>
+        <w:t>A. Các kỹ thuật chuyển đổi dữ liệu phổ biến</w:t>
+      </w:r>
+    </w:p>
+    <w:p>
+      <w:pPr>
         <w:numPr>
           <w:ilvl w:val="0"/>
-          <w:numId w:val="2"/>
-        </w:numPr>
-        <w:rPr>
-          <w:rFonts w:cs="Times New Roman"/>
-          <w:i/>
-          <w:color w:val="00B050"/>
-        </w:rPr>
-      </w:pPr>
-      <w:r>
-        <w:rPr>
-          <w:rFonts w:cs="Times New Roman"/>
-          <w:i/>
-          <w:color w:val="00B050"/>
-        </w:rPr>
-        <w:t>Trình bày các kỹ thuật chuyển đổi</w:t>
-      </w:r>
-    </w:p>
-    <w:p>
-      <w:pPr>
-        <w:pStyle w:val="ListParagraph"/>
+          <w:numId w:val="54"/>
+        </w:numPr>
+        <w:rPr>
+          <w:lang w:val="en-US"/>
+        </w:rPr>
+      </w:pPr>
+      <w:r>
+        <w:rPr>
+          <w:b/>
+          <w:bCs/>
+          <w:lang w:val="en-US"/>
+        </w:rPr>
+        <w:t>Điền khuyết dữ liệu (Imputation):</w:t>
+      </w:r>
+      <w:r>
+        <w:rPr>
+          <w:lang w:val="en-US"/>
+        </w:rPr>
+        <w:t> Sử dụng các số liệu thống kê đại diện như trung bình (Mean), trung vị (Median) hoặc yếu vị (Mode) của phân phối mẫu để thay thế cho các giá trị bị khuyết thiếu (Null/Blank).</w:t>
+      </w:r>
+    </w:p>
+    <w:p>
+      <w:pPr>
         <w:numPr>
           <w:ilvl w:val="0"/>
-          <w:numId w:val="2"/>
-        </w:numPr>
-        <w:rPr>
-          <w:rFonts w:cs="Times New Roman"/>
-          <w:i/>
-          <w:color w:val="00B050"/>
-        </w:rPr>
-      </w:pPr>
-      <w:r>
-        <w:rPr>
-          <w:rFonts w:cs="Times New Roman"/>
-          <w:i/>
-          <w:color w:val="00B050"/>
-        </w:rPr>
-        <w:t>Kỹ thuật nào được chọn áp dụng cho dự án.</w:t>
-      </w:r>
-    </w:p>
-    <w:p>
-      <w:pPr>
-        <w:rPr>
-          <w:rFonts w:cs="Times New Roman"/>
-        </w:rPr>
-      </w:pPr>
-      <w:r>
-        <w:rPr>
-          <w:rFonts w:cs="Times New Roman"/>
-          <w:color w:val="00B050"/>
-          <w:highlight w:val="yellow"/>
-        </w:rPr>
-        <w:t>…</w:t>
-      </w:r>
-      <w:r>
-        <w:rPr>
-          <w:rFonts w:cs="Times New Roman"/>
-        </w:rPr>
-        <w:t xml:space="preserve"> </w:t>
-      </w:r>
-    </w:p>
+          <w:numId w:val="54"/>
+        </w:numPr>
+        <w:rPr>
+          <w:lang w:val="en-US"/>
+        </w:rPr>
+      </w:pPr>
+      <w:r>
+        <w:rPr>
+          <w:b/>
+          <w:bCs/>
+          <w:lang w:val="en-US"/>
+        </w:rPr>
+        <w:lastRenderedPageBreak/>
+        <w:t>Tính toán cột dẫn xuất (Feature/Attribute Derivation):</w:t>
+      </w:r>
+      <w:r>
+        <w:rPr>
+          <w:lang w:val="en-US"/>
+        </w:rPr>
+        <w:t> Sử dụng công thức toán học hoặc logic nghiệp vụ để tạo ra các cột mới từ những trường thông tin có sẵn.</w:t>
+      </w:r>
+    </w:p>
+    <w:p>
+      <w:pPr>
+        <w:numPr>
+          <w:ilvl w:val="0"/>
+          <w:numId w:val="54"/>
+        </w:numPr>
+        <w:rPr>
+          <w:lang w:val="en-US"/>
+        </w:rPr>
+      </w:pPr>
+      <w:r>
+        <w:rPr>
+          <w:b/>
+          <w:bCs/>
+          <w:lang w:val="en-US"/>
+        </w:rPr>
+        <w:t>Chuẩn hóa cấu trúc (Dimensional Modeling):</w:t>
+      </w:r>
+      <w:r>
+        <w:rPr>
+          <w:lang w:val="en-US"/>
+        </w:rPr>
+        <w:t> Phân rã bảng phẳng phi chuẩn hóa thành các bảng Dimension (Bảng chiều) và Fact (Bảng sự kiện) nhằm giảm trùng lặp thông tin và tối ưu hóa truy vấn.</w:t>
+      </w:r>
+    </w:p>
+    <w:p>
+      <w:pPr>
+        <w:numPr>
+          <w:ilvl w:val="0"/>
+          <w:numId w:val="54"/>
+        </w:numPr>
+        <w:rPr>
+          <w:lang w:val="en-US"/>
+        </w:rPr>
+      </w:pPr>
+      <w:r>
+        <w:rPr>
+          <w:b/>
+          <w:bCs/>
+          <w:lang w:val="en-US"/>
+        </w:rPr>
+        <w:t>Chuyển đổi định dạng tệp (Format Conversion):</w:t>
+      </w:r>
+      <w:r>
+        <w:rPr>
+          <w:lang w:val="en-US"/>
+        </w:rPr>
+        <w:t> Đọc dữ liệu từ định dạng này và lưu lại dưới định dạng tối ưu hơn (ví dụ: XLS sang CSV, CSV sang Parquet).</w:t>
+      </w:r>
+    </w:p>
+    <w:p>
+      <w:pPr>
+        <w:rPr>
+          <w:lang w:val="en-US"/>
+        </w:rPr>
+      </w:pPr>
+      <w:r>
+        <w:rPr>
+          <w:lang w:val="en-US"/>
+        </w:rPr>
+        <w:t>B. Kỹ thuật được chọn áp dụng cho dự án</w:t>
+      </w:r>
+    </w:p>
+    <w:p>
+      <w:r>
+        <w:rPr>
+          <w:lang w:val="en-US"/>
+        </w:rPr>
+        <w:t>Dự án Credit Risk kết hợp linh hoạt hai công cụ để tối ưu hiệu năng: </w:t>
+      </w:r>
+      <w:r>
+        <w:rPr>
+          <w:b/>
+          <w:bCs/>
+          <w:lang w:val="en-US"/>
+        </w:rPr>
+        <w:t>Python (Pandas)</w:t>
+      </w:r>
+      <w:r>
+        <w:rPr>
+          <w:lang w:val="en-US"/>
+        </w:rPr>
+        <w:t> cho khâu xử lý tính toán logic phức tạp trên RAM và </w:t>
+      </w:r>
+      <w:r>
+        <w:rPr>
+          <w:b/>
+          <w:bCs/>
+          <w:lang w:val="en-US"/>
+        </w:rPr>
+        <w:t>SQL Server (T-SQL)</w:t>
+      </w:r>
+      <w:r>
+        <w:rPr>
+          <w:lang w:val="en-US"/>
+        </w:rPr>
+        <w:t> cho khâu chuyển đổi cấu trúc cơ sở dữ liệu.</w:t>
+      </w:r>
+    </w:p>
+    <w:p>
+      <w:pPr>
+        <w:numPr>
+          <w:ilvl w:val="0"/>
+          <w:numId w:val="56"/>
+        </w:numPr>
+        <w:tabs>
+          <w:tab w:val="num" w:pos="720"/>
+        </w:tabs>
+        <w:rPr>
+          <w:lang w:val="en-US"/>
+        </w:rPr>
+      </w:pPr>
+      <w:r>
+        <w:rPr>
+          <w:b/>
+          <w:bCs/>
+          <w:lang w:val="en-US"/>
+        </w:rPr>
+        <w:t>Kỹ thuật Điền khuyết theo nhóm (Groupby Imputation) bằng Python Pandas:</w:t>
+      </w:r>
+    </w:p>
+    <w:p>
+      <w:pPr>
+        <w:numPr>
+          <w:ilvl w:val="1"/>
+          <w:numId w:val="56"/>
+        </w:numPr>
+        <w:tabs>
+          <w:tab w:val="num" w:pos="1440"/>
+        </w:tabs>
+        <w:rPr>
+          <w:lang w:val="en-US"/>
+        </w:rPr>
+      </w:pPr>
+      <w:r>
+        <w:rPr>
+          <w:lang w:val="en-US"/>
+        </w:rPr>
+        <w:t>Sử dụng giá trị trung vị (Median) của từng phân nhóm cụ thể thay vì lấy trung vị của toàn bộ tập dữ liệu. Điều này giúp giá trị điền khuyết có độ chính xác cao và sát thực tế nhất (ví dụ: điền lãi suất khuyết thiếu bằng trung vị của riêng nhóm có cùng xếp hạng tín dụng loan_grade).</w:t>
+      </w:r>
+    </w:p>
+    <w:p>
+      <w:pPr>
+        <w:numPr>
+          <w:ilvl w:val="0"/>
+          <w:numId w:val="56"/>
+        </w:numPr>
+        <w:tabs>
+          <w:tab w:val="num" w:pos="720"/>
+        </w:tabs>
+        <w:rPr>
+          <w:lang w:val="en-US"/>
+        </w:rPr>
+      </w:pPr>
+      <w:r>
+        <w:rPr>
+          <w:b/>
+          <w:bCs/>
+          <w:lang w:val="en-US"/>
+        </w:rPr>
+        <w:t>Kỹ thuật Phép toán Dẫn xuất (Calculated Expression):</w:t>
+      </w:r>
+    </w:p>
+    <w:p>
+      <w:pPr>
+        <w:numPr>
+          <w:ilvl w:val="1"/>
+          <w:numId w:val="56"/>
+        </w:numPr>
+        <w:tabs>
+          <w:tab w:val="num" w:pos="1440"/>
+        </w:tabs>
+        <w:rPr>
+          <w:lang w:val="en-US"/>
+        </w:rPr>
+      </w:pPr>
+      <w:r>
+        <w:rPr>
+          <w:lang w:val="en-US"/>
+        </w:rPr>
+        <w:t>Tính toán tỷ lệ nợ trên thu nhập dự phòng bằng phép toán chia thực tế: (other_debt + loan_amnt) / person_income.</w:t>
+      </w:r>
+    </w:p>
+    <w:p>
+      <w:pPr>
+        <w:numPr>
+          <w:ilvl w:val="0"/>
+          <w:numId w:val="56"/>
+        </w:numPr>
+        <w:tabs>
+          <w:tab w:val="num" w:pos="720"/>
+        </w:tabs>
+        <w:rPr>
+          <w:lang w:val="en-US"/>
+        </w:rPr>
+      </w:pPr>
+      <w:r>
+        <w:rPr>
+          <w:b/>
+          <w:bCs/>
+          <w:lang w:val="en-US"/>
+        </w:rPr>
+        <w:t>Kỹ thuật Chuẩn hóa cấu trúc hình sao bằng SQL Stored Procedure (sp_load_star_schema):</w:t>
+      </w:r>
+    </w:p>
+    <w:p>
+      <w:pPr>
+        <w:numPr>
+          <w:ilvl w:val="1"/>
+          <w:numId w:val="56"/>
+        </w:numPr>
+        <w:tabs>
+          <w:tab w:val="num" w:pos="1440"/>
+        </w:tabs>
+        <w:rPr>
+          <w:lang w:val="en-US"/>
+        </w:rPr>
+      </w:pPr>
+      <w:r>
+        <w:rPr>
+          <w:lang w:val="en-US"/>
+        </w:rPr>
+        <w:t>Sử dụng các câu lệnh T-SQL (INSERT INTO...SELECT DISTINCT) để tự động phân rã dữ liệu từ bảng Staging vào các bảng Dim và Fact, kết hợp tạo khóa thay thế tự tăng (Identity/Surrogate Key) để tối ưu hóa liên kết bảng.</w:t>
+      </w:r>
+    </w:p>
+    <w:p/>
     <w:p>
       <w:pPr>
         <w:pStyle w:val="Heading3"/>
@@ -17959,81 +18286,984 @@
           <w:rFonts w:ascii="Times New Roman" w:hAnsi="Times New Roman" w:cs="Times New Roman"/>
         </w:rPr>
       </w:pPr>
-      <w:bookmarkStart w:id="37" w:name="_Toc232240924"/>
+      <w:bookmarkStart w:id="36" w:name="_Toc232240924"/>
       <w:r>
         <w:rPr>
           <w:rFonts w:ascii="Times New Roman" w:hAnsi="Times New Roman" w:cs="Times New Roman"/>
         </w:rPr>
         <w:t>Trình bày các phép chuyển đổi trong dự án</w:t>
       </w:r>
-      <w:bookmarkEnd w:id="37"/>
-    </w:p>
-    <w:p>
-      <w:pPr>
-        <w:pStyle w:val="ListParagraph"/>
+      <w:bookmarkEnd w:id="36"/>
+    </w:p>
+    <w:p>
+      <w:pPr>
+        <w:rPr>
+          <w:lang w:val="en-US"/>
+        </w:rPr>
+      </w:pPr>
+      <w:r>
+        <w:rPr>
+          <w:lang w:val="en-US"/>
+        </w:rPr>
+        <w:t>Các phép chuyển đổi cụ thể được triển khai trong dự án tác động trực tiếp đến từng cột và từng dòng dữ liệu:</w:t>
+      </w:r>
+    </w:p>
+    <w:p>
+      <w:pPr>
         <w:numPr>
           <w:ilvl w:val="0"/>
-          <w:numId w:val="2"/>
-        </w:numPr>
-        <w:rPr>
-          <w:rFonts w:cs="Times New Roman"/>
+          <w:numId w:val="57"/>
+        </w:numPr>
+        <w:rPr>
+          <w:lang w:val="en-US"/>
+        </w:rPr>
+      </w:pPr>
+      <w:r>
+        <w:rPr>
+          <w:lang w:val="en-US"/>
+        </w:rPr>
+        <w:t>A. Phép chuyển đổi tác động trên từng cột (Column-level Transformation)</w:t>
+      </w:r>
+    </w:p>
+    <w:p>
+      <w:pPr>
+        <w:numPr>
+          <w:ilvl w:val="0"/>
+          <w:numId w:val="57"/>
+        </w:numPr>
+        <w:rPr>
+          <w:lang w:val="en-US"/>
+        </w:rPr>
+      </w:pPr>
+      <w:r>
+        <w:rPr>
+          <w:b/>
+          <w:bCs/>
+          <w:lang w:val="en-US"/>
+        </w:rPr>
+        <w:t>Cột person_emp_length (Số năm làm việc):</w:t>
+      </w:r>
+    </w:p>
+    <w:p>
+      <w:pPr>
+        <w:numPr>
+          <w:ilvl w:val="1"/>
+          <w:numId w:val="57"/>
+        </w:numPr>
+        <w:rPr>
+          <w:lang w:val="en-US"/>
+        </w:rPr>
+      </w:pPr>
+      <w:r>
+        <w:rPr>
           <w:i/>
-          <w:color w:val="00B050"/>
-        </w:rPr>
-      </w:pPr>
-      <w:r>
-        <w:rPr>
-          <w:rFonts w:cs="Times New Roman"/>
+          <w:iCs/>
+          <w:lang w:val="en-US"/>
+        </w:rPr>
+        <w:lastRenderedPageBreak/>
+        <w:t>Công thức chuyển đổi:</w:t>
+      </w:r>
+      <w:r>
+        <w:rPr>
+          <w:lang w:val="en-US"/>
+        </w:rPr>
+        <w:t> Điền giá trị khuyết thiếu bằng giá trị trung vị theo nhóm tuổi:</w:t>
+      </w:r>
+      <w:r>
+        <w:t xml:space="preserve"> </w:t>
+      </w:r>
+      <m:oMath>
+        <m:r>
+          <w:rPr>
+            <w:rFonts w:ascii="Cambria Math" w:hAnsi="Cambria Math"/>
+          </w:rPr>
+          <m:t>Median</m:t>
+        </m:r>
+        <m:d>
+          <m:dPr>
+            <m:ctrlPr>
+              <w:rPr>
+                <w:rFonts w:ascii="Cambria Math" w:hAnsi="Cambria Math"/>
+                <w:i/>
+              </w:rPr>
+            </m:ctrlPr>
+          </m:dPr>
+          <m:e>
+            <m:r>
+              <w:rPr>
+                <w:rFonts w:ascii="Cambria Math" w:hAnsi="Cambria Math"/>
+              </w:rPr>
+              <m:t>perso</m:t>
+            </m:r>
+            <m:sSub>
+              <m:sSubPr>
+                <m:ctrlPr>
+                  <w:rPr>
+                    <w:rFonts w:ascii="Cambria Math" w:hAnsi="Cambria Math"/>
+                    <w:i/>
+                  </w:rPr>
+                </m:ctrlPr>
+              </m:sSubPr>
+              <m:e>
+                <m:r>
+                  <w:rPr>
+                    <w:rFonts w:ascii="Cambria Math" w:hAnsi="Cambria Math"/>
+                  </w:rPr>
+                  <m:t>n</m:t>
+                </m:r>
+              </m:e>
+              <m:sub>
+                <m:r>
+                  <w:rPr>
+                    <w:rFonts w:ascii="Cambria Math" w:hAnsi="Cambria Math"/>
+                  </w:rPr>
+                  <m:t>em</m:t>
+                </m:r>
+                <m:sSub>
+                  <m:sSubPr>
+                    <m:ctrlPr>
+                      <w:rPr>
+                        <w:rFonts w:ascii="Cambria Math" w:hAnsi="Cambria Math"/>
+                        <w:i/>
+                      </w:rPr>
+                    </m:ctrlPr>
+                  </m:sSubPr>
+                  <m:e>
+                    <m:r>
+                      <w:rPr>
+                        <w:rFonts w:ascii="Cambria Math" w:hAnsi="Cambria Math"/>
+                      </w:rPr>
+                      <m:t>p</m:t>
+                    </m:r>
+                  </m:e>
+                  <m:sub>
+                    <m:r>
+                      <w:rPr>
+                        <w:rFonts w:ascii="Cambria Math" w:hAnsi="Cambria Math"/>
+                      </w:rPr>
+                      <m:t>length</m:t>
+                    </m:r>
+                  </m:sub>
+                </m:sSub>
+              </m:sub>
+            </m:sSub>
+          </m:e>
+        </m:d>
+        <m:r>
+          <m:rPr>
+            <m:nor/>
+          </m:rPr>
+          <w:rPr>
+            <w:rFonts w:ascii="Cambria Math" w:hAnsi="Cambria Math"/>
+          </w:rPr>
+          <m:t xml:space="preserve"> grouped by </m:t>
+        </m:r>
+        <m:r>
+          <w:rPr>
+            <w:rFonts w:ascii="Cambria Math" w:hAnsi="Cambria Math"/>
+          </w:rPr>
+          <m:t>perso</m:t>
+        </m:r>
+        <m:sSub>
+          <m:sSubPr>
+            <m:ctrlPr>
+              <w:rPr>
+                <w:rFonts w:ascii="Cambria Math" w:hAnsi="Cambria Math"/>
+                <w:i/>
+              </w:rPr>
+            </m:ctrlPr>
+          </m:sSubPr>
+          <m:e>
+            <m:r>
+              <w:rPr>
+                <w:rFonts w:ascii="Cambria Math" w:hAnsi="Cambria Math"/>
+              </w:rPr>
+              <m:t>n</m:t>
+            </m:r>
+          </m:e>
+          <m:sub>
+            <m:r>
+              <w:rPr>
+                <w:rFonts w:ascii="Cambria Math" w:hAnsi="Cambria Math"/>
+              </w:rPr>
+              <m:t>age</m:t>
+            </m:r>
+          </m:sub>
+        </m:sSub>
+      </m:oMath>
+    </w:p>
+    <w:p>
+      <w:pPr>
+        <w:numPr>
+          <w:ilvl w:val="0"/>
+          <w:numId w:val="57"/>
+        </w:numPr>
+        <w:rPr>
+          <w:lang w:val="en-US"/>
+        </w:rPr>
+      </w:pPr>
+      <w:r>
+        <w:rPr>
+          <w:b/>
+          <w:bCs/>
+          <w:lang w:val="en-US"/>
+        </w:rPr>
+        <w:t>Cột loan_int_rate (Lãi suất khoản vay):</w:t>
+      </w:r>
+    </w:p>
+    <w:p>
+      <w:pPr>
+        <w:numPr>
+          <w:ilvl w:val="1"/>
+          <w:numId w:val="57"/>
+        </w:numPr>
+        <w:rPr>
+          <w:lang w:val="en-US"/>
+        </w:rPr>
+      </w:pPr>
+      <w:r>
+        <w:rPr>
           <w:i/>
-          <w:color w:val="00B050"/>
-        </w:rPr>
-        <w:t>Trình bày cụ thể các bước tác động cụ thể đến bộ dữ liệu dự án (từng cột, từng dòng).</w:t>
-      </w:r>
-    </w:p>
-    <w:p>
-      <w:pPr>
-        <w:pStyle w:val="ListParagraph"/>
+          <w:iCs/>
+          <w:lang w:val="en-US"/>
+        </w:rPr>
+        <w:t>Công thức chuyển đổi:</w:t>
+      </w:r>
+      <w:r>
+        <w:rPr>
+          <w:lang w:val="en-US"/>
+        </w:rPr>
+        <w:t xml:space="preserve"> Điền giá trị khuyết thiếu bằng giá trị trung vị theo xếp hạng tín dụng: </w:t>
+      </w:r>
+      <m:oMath>
+        <m:r>
+          <w:rPr>
+            <w:rFonts w:ascii="Cambria Math" w:hAnsi="Cambria Math"/>
+            <w:lang w:val="en-US"/>
+          </w:rPr>
+          <m:t>Median</m:t>
+        </m:r>
+        <m:d>
+          <m:dPr>
+            <m:ctrlPr>
+              <w:rPr>
+                <w:rFonts w:ascii="Cambria Math" w:hAnsi="Cambria Math"/>
+                <w:i/>
+                <w:lang w:val="en-US"/>
+              </w:rPr>
+            </m:ctrlPr>
+          </m:dPr>
+          <m:e>
+            <m:r>
+              <w:rPr>
+                <w:rFonts w:ascii="Cambria Math" w:hAnsi="Cambria Math"/>
+                <w:lang w:val="en-US"/>
+              </w:rPr>
+              <m:t>loa</m:t>
+            </m:r>
+            <m:sSub>
+              <m:sSubPr>
+                <m:ctrlPr>
+                  <w:rPr>
+                    <w:rFonts w:ascii="Cambria Math" w:hAnsi="Cambria Math"/>
+                    <w:i/>
+                    <w:lang w:val="en-US"/>
+                  </w:rPr>
+                </m:ctrlPr>
+              </m:sSubPr>
+              <m:e>
+                <m:r>
+                  <w:rPr>
+                    <w:rFonts w:ascii="Cambria Math" w:hAnsi="Cambria Math"/>
+                    <w:lang w:val="en-US"/>
+                  </w:rPr>
+                  <m:t>n</m:t>
+                </m:r>
+              </m:e>
+              <m:sub>
+                <m:r>
+                  <w:rPr>
+                    <w:rFonts w:ascii="Cambria Math" w:hAnsi="Cambria Math"/>
+                    <w:lang w:val="en-US"/>
+                  </w:rPr>
+                  <m:t>in</m:t>
+                </m:r>
+                <m:sSub>
+                  <m:sSubPr>
+                    <m:ctrlPr>
+                      <w:rPr>
+                        <w:rFonts w:ascii="Cambria Math" w:hAnsi="Cambria Math"/>
+                        <w:i/>
+                        <w:lang w:val="en-US"/>
+                      </w:rPr>
+                    </m:ctrlPr>
+                  </m:sSubPr>
+                  <m:e>
+                    <m:r>
+                      <w:rPr>
+                        <w:rFonts w:ascii="Cambria Math" w:hAnsi="Cambria Math"/>
+                        <w:lang w:val="en-US"/>
+                      </w:rPr>
+                      <m:t>t</m:t>
+                    </m:r>
+                  </m:e>
+                  <m:sub>
+                    <m:r>
+                      <w:rPr>
+                        <w:rFonts w:ascii="Cambria Math" w:hAnsi="Cambria Math"/>
+                        <w:lang w:val="en-US"/>
+                      </w:rPr>
+                      <m:t>rate</m:t>
+                    </m:r>
+                  </m:sub>
+                </m:sSub>
+              </m:sub>
+            </m:sSub>
+          </m:e>
+        </m:d>
+        <m:r>
+          <m:rPr>
+            <m:nor/>
+          </m:rPr>
+          <w:rPr>
+            <w:rFonts w:ascii="Cambria Math" w:hAnsi="Cambria Math"/>
+            <w:lang w:val="en-US"/>
+          </w:rPr>
+          <m:t xml:space="preserve"> grouped by </m:t>
+        </m:r>
+        <m:r>
+          <w:rPr>
+            <w:rFonts w:ascii="Cambria Math" w:hAnsi="Cambria Math"/>
+            <w:lang w:val="en-US"/>
+          </w:rPr>
+          <m:t>loa</m:t>
+        </m:r>
+        <m:sSub>
+          <m:sSubPr>
+            <m:ctrlPr>
+              <w:rPr>
+                <w:rFonts w:ascii="Cambria Math" w:hAnsi="Cambria Math"/>
+                <w:i/>
+                <w:lang w:val="en-US"/>
+              </w:rPr>
+            </m:ctrlPr>
+          </m:sSubPr>
+          <m:e>
+            <m:r>
+              <w:rPr>
+                <w:rFonts w:ascii="Cambria Math" w:hAnsi="Cambria Math"/>
+                <w:lang w:val="en-US"/>
+              </w:rPr>
+              <m:t>n</m:t>
+            </m:r>
+          </m:e>
+          <m:sub>
+            <m:r>
+              <w:rPr>
+                <w:rFonts w:ascii="Cambria Math" w:hAnsi="Cambria Math"/>
+                <w:lang w:val="en-US"/>
+              </w:rPr>
+              <m:t>grade</m:t>
+            </m:r>
+          </m:sub>
+        </m:sSub>
+      </m:oMath>
+    </w:p>
+    <w:p>
+      <w:pPr>
         <w:numPr>
           <w:ilvl w:val="0"/>
-          <w:numId w:val="2"/>
-        </w:numPr>
-        <w:rPr>
-          <w:rFonts w:cs="Times New Roman"/>
+          <w:numId w:val="57"/>
+        </w:numPr>
+        <w:rPr>
+          <w:lang w:val="en-US"/>
+        </w:rPr>
+      </w:pPr>
+      <w:r>
+        <w:rPr>
+          <w:b/>
+          <w:bCs/>
+          <w:lang w:val="en-US"/>
+        </w:rPr>
+        <w:t>Cột debt_to_income_ratio (Tỷ lệ nợ trên thu nhập):</w:t>
+      </w:r>
+    </w:p>
+    <w:p>
+      <w:pPr>
+        <w:numPr>
+          <w:ilvl w:val="1"/>
+          <w:numId w:val="57"/>
+        </w:numPr>
+        <w:rPr>
+          <w:lang w:val="en-US"/>
+        </w:rPr>
+      </w:pPr>
+      <w:r>
+        <w:rPr>
           <w:i/>
-          <w:color w:val="00B050"/>
-        </w:rPr>
-      </w:pPr>
-      <w:r>
-        <w:rPr>
-          <w:rFonts w:cs="Times New Roman"/>
+          <w:iCs/>
+          <w:lang w:val="en-US"/>
+        </w:rPr>
+        <w:t>Công thức chuyển đổi:</w:t>
+      </w:r>
+      <w:r>
+        <w:rPr>
+          <w:lang w:val="en-US"/>
+        </w:rPr>
+        <w:t xml:space="preserve"> Nếu khuyết thiếu, áp dụng công thức: </w:t>
+      </w:r>
+      <m:oMath>
+        <m:r>
+          <w:rPr>
+            <w:rFonts w:ascii="Cambria Math" w:hAnsi="Cambria Math"/>
+            <w:lang w:val="en-US"/>
+          </w:rPr>
+          <m:t>deb</m:t>
+        </m:r>
+        <m:sSub>
+          <m:sSubPr>
+            <m:ctrlPr>
+              <w:rPr>
+                <w:rFonts w:ascii="Cambria Math" w:hAnsi="Cambria Math"/>
+                <w:i/>
+                <w:lang w:val="en-US"/>
+              </w:rPr>
+            </m:ctrlPr>
+          </m:sSubPr>
+          <m:e>
+            <m:r>
+              <w:rPr>
+                <w:rFonts w:ascii="Cambria Math" w:hAnsi="Cambria Math"/>
+                <w:lang w:val="en-US"/>
+              </w:rPr>
+              <m:t>t</m:t>
+            </m:r>
+          </m:e>
+          <m:sub>
+            <m:r>
+              <w:rPr>
+                <w:rFonts w:ascii="Cambria Math" w:hAnsi="Cambria Math"/>
+                <w:lang w:val="en-US"/>
+              </w:rPr>
+              <m:t>t</m:t>
+            </m:r>
+            <m:sSub>
+              <m:sSubPr>
+                <m:ctrlPr>
+                  <w:rPr>
+                    <w:rFonts w:ascii="Cambria Math" w:hAnsi="Cambria Math"/>
+                    <w:i/>
+                    <w:lang w:val="en-US"/>
+                  </w:rPr>
+                </m:ctrlPr>
+              </m:sSubPr>
+              <m:e>
+                <m:r>
+                  <w:rPr>
+                    <w:rFonts w:ascii="Cambria Math" w:hAnsi="Cambria Math"/>
+                    <w:lang w:val="en-US"/>
+                  </w:rPr>
+                  <m:t>o</m:t>
+                </m:r>
+              </m:e>
+              <m:sub>
+                <m:r>
+                  <w:rPr>
+                    <w:rFonts w:ascii="Cambria Math" w:hAnsi="Cambria Math"/>
+                    <w:lang w:val="en-US"/>
+                  </w:rPr>
+                  <m:t>incom</m:t>
+                </m:r>
+                <m:sSub>
+                  <m:sSubPr>
+                    <m:ctrlPr>
+                      <w:rPr>
+                        <w:rFonts w:ascii="Cambria Math" w:hAnsi="Cambria Math"/>
+                        <w:i/>
+                        <w:lang w:val="en-US"/>
+                      </w:rPr>
+                    </m:ctrlPr>
+                  </m:sSubPr>
+                  <m:e>
+                    <m:r>
+                      <w:rPr>
+                        <w:rFonts w:ascii="Cambria Math" w:hAnsi="Cambria Math"/>
+                        <w:lang w:val="en-US"/>
+                      </w:rPr>
+                      <m:t>e</m:t>
+                    </m:r>
+                  </m:e>
+                  <m:sub>
+                    <m:r>
+                      <w:rPr>
+                        <w:rFonts w:ascii="Cambria Math" w:hAnsi="Cambria Math"/>
+                        <w:lang w:val="en-US"/>
+                      </w:rPr>
+                      <m:t>ratio</m:t>
+                    </m:r>
+                  </m:sub>
+                </m:sSub>
+              </m:sub>
+            </m:sSub>
+          </m:sub>
+        </m:sSub>
+        <m:r>
+          <w:rPr>
+            <w:rFonts w:ascii="Cambria Math" w:hAnsi="Cambria Math"/>
+            <w:lang w:val="en-US"/>
+          </w:rPr>
+          <m:t>=</m:t>
+        </m:r>
+        <m:f>
+          <m:fPr>
+            <m:ctrlPr>
+              <w:rPr>
+                <w:rFonts w:ascii="Cambria Math" w:hAnsi="Cambria Math"/>
+                <w:i/>
+                <w:lang w:val="en-US"/>
+              </w:rPr>
+            </m:ctrlPr>
+          </m:fPr>
+          <m:num>
+            <m:d>
+              <m:dPr>
+                <m:ctrlPr>
+                  <w:rPr>
+                    <w:rFonts w:ascii="Cambria Math" w:hAnsi="Cambria Math"/>
+                    <w:i/>
+                    <w:lang w:val="en-US"/>
+                  </w:rPr>
+                </m:ctrlPr>
+              </m:dPr>
+              <m:e>
+                <m:r>
+                  <w:rPr>
+                    <w:rFonts w:ascii="Cambria Math" w:hAnsi="Cambria Math"/>
+                    <w:lang w:val="en-US"/>
+                  </w:rPr>
+                  <m:t>othe</m:t>
+                </m:r>
+                <m:sSub>
+                  <m:sSubPr>
+                    <m:ctrlPr>
+                      <w:rPr>
+                        <w:rFonts w:ascii="Cambria Math" w:hAnsi="Cambria Math"/>
+                        <w:i/>
+                        <w:lang w:val="en-US"/>
+                      </w:rPr>
+                    </m:ctrlPr>
+                  </m:sSubPr>
+                  <m:e>
+                    <m:r>
+                      <w:rPr>
+                        <w:rFonts w:ascii="Cambria Math" w:hAnsi="Cambria Math"/>
+                        <w:lang w:val="en-US"/>
+                      </w:rPr>
+                      <m:t>r</m:t>
+                    </m:r>
+                  </m:e>
+                  <m:sub>
+                    <m:r>
+                      <w:rPr>
+                        <w:rFonts w:ascii="Cambria Math" w:hAnsi="Cambria Math"/>
+                        <w:lang w:val="en-US"/>
+                      </w:rPr>
+                      <m:t>debt</m:t>
+                    </m:r>
+                  </m:sub>
+                </m:sSub>
+                <m:r>
+                  <w:rPr>
+                    <w:rFonts w:ascii="Cambria Math" w:hAnsi="Cambria Math"/>
+                    <w:lang w:val="en-US"/>
+                  </w:rPr>
+                  <m:t>+ loa</m:t>
+                </m:r>
+                <m:sSub>
+                  <m:sSubPr>
+                    <m:ctrlPr>
+                      <w:rPr>
+                        <w:rFonts w:ascii="Cambria Math" w:hAnsi="Cambria Math"/>
+                        <w:i/>
+                        <w:lang w:val="en-US"/>
+                      </w:rPr>
+                    </m:ctrlPr>
+                  </m:sSubPr>
+                  <m:e>
+                    <m:r>
+                      <w:rPr>
+                        <w:rFonts w:ascii="Cambria Math" w:hAnsi="Cambria Math"/>
+                        <w:lang w:val="en-US"/>
+                      </w:rPr>
+                      <m:t>n</m:t>
+                    </m:r>
+                  </m:e>
+                  <m:sub>
+                    <m:r>
+                      <w:rPr>
+                        <w:rFonts w:ascii="Cambria Math" w:hAnsi="Cambria Math"/>
+                        <w:lang w:val="en-US"/>
+                      </w:rPr>
+                      <m:t>amnt</m:t>
+                    </m:r>
+                  </m:sub>
+                </m:sSub>
+              </m:e>
+            </m:d>
+          </m:num>
+          <m:den>
+            <m:r>
+              <w:rPr>
+                <w:rFonts w:ascii="Cambria Math" w:hAnsi="Cambria Math"/>
+                <w:lang w:val="en-US"/>
+              </w:rPr>
+              <m:t>perso</m:t>
+            </m:r>
+            <m:sSub>
+              <m:sSubPr>
+                <m:ctrlPr>
+                  <w:rPr>
+                    <w:rFonts w:ascii="Cambria Math" w:hAnsi="Cambria Math"/>
+                    <w:i/>
+                    <w:lang w:val="en-US"/>
+                  </w:rPr>
+                </m:ctrlPr>
+              </m:sSubPr>
+              <m:e>
+                <m:r>
+                  <w:rPr>
+                    <w:rFonts w:ascii="Cambria Math" w:hAnsi="Cambria Math"/>
+                    <w:lang w:val="en-US"/>
+                  </w:rPr>
+                  <m:t>n</m:t>
+                </m:r>
+              </m:e>
+              <m:sub>
+                <m:r>
+                  <w:rPr>
+                    <w:rFonts w:ascii="Cambria Math" w:hAnsi="Cambria Math"/>
+                    <w:lang w:val="en-US"/>
+                  </w:rPr>
+                  <m:t>income</m:t>
+                </m:r>
+              </m:sub>
+            </m:sSub>
+          </m:den>
+        </m:f>
+      </m:oMath>
+    </w:p>
+    <w:p>
+      <w:pPr>
+        <w:numPr>
+          <w:ilvl w:val="0"/>
+          <w:numId w:val="57"/>
+        </w:numPr>
+        <w:rPr>
+          <w:lang w:val="en-US"/>
+        </w:rPr>
+      </w:pPr>
+      <w:r>
+        <w:rPr>
+          <w:b/>
+          <w:bCs/>
+          <w:lang w:val="en-US"/>
+        </w:rPr>
+        <w:t>Cột status (Trạng thái dòng dữ liệu - Cột tự sinh):</w:t>
+      </w:r>
+    </w:p>
+    <w:p>
+      <w:pPr>
+        <w:numPr>
+          <w:ilvl w:val="1"/>
+          <w:numId w:val="57"/>
+        </w:numPr>
+        <w:rPr>
+          <w:lang w:val="en-US"/>
+        </w:rPr>
+      </w:pPr>
+      <w:r>
+        <w:rPr>
           <w:i/>
-          <w:color w:val="00B050"/>
-        </w:rPr>
-        <w:t>Việc này giúp lưu vết các chỉnh sửa thay đổi trên</w:t>
-      </w:r>
-      <w:r>
-        <w:rPr>
-          <w:rFonts w:cs="Times New Roman"/>
-          <w:i/>
-          <w:color w:val="00B050"/>
-        </w:rPr>
-        <w:t>.</w:t>
-      </w:r>
-    </w:p>
-    <w:p>
-      <w:pPr>
-        <w:rPr>
-          <w:rFonts w:cs="Times New Roman"/>
           <w:iCs/>
-        </w:rPr>
-      </w:pPr>
-      <w:r>
-        <w:rPr>
-          <w:rFonts w:cs="Times New Roman"/>
-          <w:iCs/>
-          <w:highlight w:val="yellow"/>
-        </w:rPr>
-        <w:t>…</w:t>
+          <w:lang w:val="en-US"/>
+        </w:rPr>
+        <w:t>Logic:</w:t>
+      </w:r>
+      <w:r>
+        <w:rPr>
+          <w:lang w:val="en-US"/>
+        </w:rPr>
+        <w:t> </w:t>
+      </w:r>
+    </w:p>
+    <w:p>
+      <w:pPr>
+        <w:numPr>
+          <w:ilvl w:val="2"/>
+          <w:numId w:val="57"/>
+        </w:numPr>
+        <w:rPr>
+          <w:lang w:val="en-US"/>
+        </w:rPr>
+      </w:pPr>
+      <w:r>
+        <w:rPr>
+          <w:lang w:val="en-US"/>
+        </w:rPr>
+        <w:t xml:space="preserve">Nếu dòng dữ liệu đi qua toàn bộ các bước kiểm tra chất lượng mà không có trường nào bị trống </w:t>
+      </w:r>
+      <w:r>
+        <w:t>=&gt;</w:t>
+      </w:r>
+      <w:r>
+        <w:rPr>
+          <w:lang w:val="en-US"/>
+        </w:rPr>
+        <w:t xml:space="preserve"> gán nhãn "pass". </w:t>
+      </w:r>
+    </w:p>
+    <w:p>
+      <w:pPr>
+        <w:numPr>
+          <w:ilvl w:val="2"/>
+          <w:numId w:val="57"/>
+        </w:numPr>
+        <w:rPr>
+          <w:lang w:val="en-US"/>
+        </w:rPr>
+      </w:pPr>
+      <w:r>
+        <w:rPr>
+          <w:lang w:val="en-US"/>
+        </w:rPr>
+        <w:t xml:space="preserve">Nếu dòng dữ liệu có trường bị khuyết nhưng đã được điền khuyết thành công </w:t>
+      </w:r>
+      <w:r>
+        <w:t xml:space="preserve">=&gt; </w:t>
+      </w:r>
+      <w:r>
+        <w:rPr>
+          <w:lang w:val="en-US"/>
+        </w:rPr>
+        <w:t>gán nhãn "warning".</w:t>
+      </w:r>
+    </w:p>
+    <w:p>
+      <w:pPr>
+        <w:numPr>
+          <w:ilvl w:val="0"/>
+          <w:numId w:val="57"/>
+        </w:numPr>
+        <w:rPr>
+          <w:lang w:val="en-US"/>
+        </w:rPr>
+      </w:pPr>
+      <w:r>
+        <w:rPr>
+          <w:lang w:val="en-US"/>
+        </w:rPr>
+        <w:t>B. Phép chuyển đổi tác động trên từng dòng và cấu trúc (Row/Structural Transformation)</w:t>
+      </w:r>
+    </w:p>
+    <w:p>
+      <w:pPr>
+        <w:rPr>
+          <w:lang w:val="en-US"/>
+        </w:rPr>
+      </w:pPr>
+      <w:r>
+        <w:rPr>
+          <w:lang w:val="en-US"/>
+        </w:rPr>
+        <w:t>Phép chuyển đổi này được thực thi thông qua Stored Procedure sp_load_star_schema để chuyển dữ liệu từ bảng Staging stg_loan vào các bảng phân tích:</w:t>
+      </w:r>
+    </w:p>
+    <w:p>
+      <w:pPr>
+        <w:numPr>
+          <w:ilvl w:val="0"/>
+          <w:numId w:val="58"/>
+        </w:numPr>
+        <w:rPr>
+          <w:lang w:val="en-US"/>
+        </w:rPr>
+      </w:pPr>
+      <w:r>
+        <w:rPr>
+          <w:b/>
+          <w:bCs/>
+          <w:lang w:val="en-US"/>
+        </w:rPr>
+        <w:t>Chuyển đổi dữ liệu Dim (Dimension Conversion):</w:t>
+      </w:r>
+    </w:p>
+    <w:p>
+      <w:pPr>
+        <w:numPr>
+          <w:ilvl w:val="1"/>
+          <w:numId w:val="58"/>
+        </w:numPr>
+        <w:rPr>
+          <w:lang w:val="en-US"/>
+        </w:rPr>
+      </w:pPr>
+      <w:r>
+        <w:rPr>
+          <w:b/>
+          <w:bCs/>
+          <w:lang w:val="en-US"/>
+        </w:rPr>
+        <w:t>Bảng DimCustomer:</w:t>
+      </w:r>
+      <w:r>
+        <w:rPr>
+          <w:lang w:val="en-US"/>
+        </w:rPr>
+        <w:t> Lọc danh sách khách hàng duy nhất từ Staging, chuyển đổi và gán một khóa chính tự tăng CustomerKey để lưu vết thông tin cá nhân của khách hàng:</w:t>
+      </w:r>
+    </w:p>
+    <w:p>
+      <w:pPr>
+        <w:numPr>
+          <w:ilvl w:val="1"/>
+          <w:numId w:val="58"/>
+        </w:numPr>
+        <w:rPr>
+          <w:lang w:val="en-US"/>
+        </w:rPr>
+      </w:pPr>
+      <w:r>
+        <w:rPr>
+          <w:lang w:val="en-US"/>
+        </w:rPr>
+        <w:drawing>
+          <wp:inline distT="0" distB="0" distL="0" distR="0" wp14:anchorId="72FB0AE3" wp14:editId="5E823CC2">
+            <wp:extent cx="5065295" cy="980589"/>
+            <wp:effectExtent l="0" t="0" r="2540" b="0"/>
+            <wp:docPr id="1105833203" name="Picture 1" descr="A screen shot of a computer&#10;&#10;AI-generated content may be incorrect."/>
+            <wp:cNvGraphicFramePr>
+              <a:graphicFrameLocks xmlns:a="http://schemas.openxmlformats.org/drawingml/2006/main" noChangeAspect="1"/>
+            </wp:cNvGraphicFramePr>
+            <a:graphic xmlns:a="http://schemas.openxmlformats.org/drawingml/2006/main">
+              <a:graphicData uri="http://schemas.openxmlformats.org/drawingml/2006/picture">
+                <pic:pic xmlns:pic="http://schemas.openxmlformats.org/drawingml/2006/picture">
+                  <pic:nvPicPr>
+                    <pic:cNvPr id="1105833203" name="Picture 1" descr="A screen shot of a computer&#10;&#10;AI-generated content may be incorrect."/>
+                    <pic:cNvPicPr/>
+                  </pic:nvPicPr>
+                  <pic:blipFill>
+                    <a:blip r:embed="rId15"/>
+                    <a:stretch>
+                      <a:fillRect/>
+                    </a:stretch>
+                  </pic:blipFill>
+                  <pic:spPr>
+                    <a:xfrm>
+                      <a:off x="0" y="0"/>
+                      <a:ext cx="5090264" cy="985423"/>
+                    </a:xfrm>
+                    <a:prstGeom prst="rect">
+                      <a:avLst/>
+                    </a:prstGeom>
+                  </pic:spPr>
+                </pic:pic>
+              </a:graphicData>
+            </a:graphic>
+          </wp:inline>
+        </w:drawing>
+      </w:r>
+      <w:r>
+        <w:rPr>
+          <w:b/>
+          <w:bCs/>
+          <w:lang w:val="en-US"/>
+        </w:rPr>
+        <w:t>Bảng DimLocation:</w:t>
+      </w:r>
+      <w:r>
+        <w:rPr>
+          <w:lang w:val="en-US"/>
+        </w:rPr>
+        <w:t> Gom nhóm dữ liệu địa lý duy nhất theo thành phố, bang, quốc gia và tọa độ để tạo bảng chiều địa lý độc lập, gán khóa LocationKey.</w:t>
+      </w:r>
+    </w:p>
+    <w:p>
+      <w:pPr>
+        <w:numPr>
+          <w:ilvl w:val="1"/>
+          <w:numId w:val="58"/>
+        </w:numPr>
+        <w:rPr>
+          <w:lang w:val="en-US"/>
+        </w:rPr>
+      </w:pPr>
+      <w:r>
+        <w:rPr>
+          <w:b/>
+          <w:bCs/>
+          <w:lang w:val="en-US"/>
+        </w:rPr>
+        <w:lastRenderedPageBreak/>
+        <w:t>Bảng DimPurpose và DimGrade:</w:t>
+      </w:r>
+      <w:r>
+        <w:rPr>
+          <w:lang w:val="en-US"/>
+        </w:rPr>
+        <w:t> Trích xuất và chuyển đổi các thuộc tính mục đích vay (loan_intent) và xếp hạng tín dụng (loan_grade) thành các danh mục quy chuẩn.</w:t>
+      </w:r>
+    </w:p>
+    <w:p>
+      <w:pPr>
+        <w:numPr>
+          <w:ilvl w:val="0"/>
+          <w:numId w:val="58"/>
+        </w:numPr>
+        <w:rPr>
+          <w:lang w:val="en-US"/>
+        </w:rPr>
+      </w:pPr>
+      <w:r>
+        <w:rPr>
+          <w:b/>
+          <w:bCs/>
+          <w:lang w:val="en-US"/>
+        </w:rPr>
+        <w:t>Chuyển đổi dữ liệu Fact (Fact Conversion):</w:t>
+      </w:r>
+    </w:p>
+    <w:p>
+      <w:pPr>
+        <w:numPr>
+          <w:ilvl w:val="1"/>
+          <w:numId w:val="58"/>
+        </w:numPr>
+        <w:rPr>
+          <w:lang w:val="en-US"/>
+        </w:rPr>
+      </w:pPr>
+      <w:r>
+        <w:rPr>
+          <w:lang w:val="en-US"/>
+        </w:rPr>
+        <w:t>Chuyển đổi từng dòng giao dịch khoản vay bằng cách thực hiện phép kết (JOIN) giữa bảng Staging stg_loan với các bảng chiều (DimCustomer, DimLocation, DimPurpose, DimGrade) dựa trên các thuộc tính tự nhiên để lấy ra các khóa thay thế (CustomerKey, LocationKey, PurposeKey, GradeKey).</w:t>
+      </w:r>
+    </w:p>
+    <w:p>
+      <w:pPr>
+        <w:numPr>
+          <w:ilvl w:val="1"/>
+          <w:numId w:val="58"/>
+        </w:numPr>
+        <w:rPr>
+          <w:lang w:val="en-US"/>
+        </w:rPr>
+      </w:pPr>
+      <w:r>
+        <w:rPr>
+          <w:lang w:val="en-US"/>
+        </w:rPr>
+        <w:t>Áp dụng chuyển đổi để nạp các khóa này kèm theo các số đo tài chính (loan_amnt, loan_int_rate, debt_to_income_ratio, loan_status) vào bảng trung tâm FactLoan. Bước này giúp bảo toàn tính toàn vẹn tham chiếu (Referential Integrity) của kho dữ liệu.</w:t>
       </w:r>
     </w:p>
     <w:p>
@@ -18047,7 +19277,7 @@
           <w:rFonts w:ascii="Times New Roman" w:hAnsi="Times New Roman" w:cs="Times New Roman"/>
         </w:rPr>
       </w:pPr>
-      <w:bookmarkStart w:id="38" w:name="_Toc232240925"/>
+      <w:bookmarkStart w:id="37" w:name="_Toc232240925"/>
       <w:r>
         <w:rPr>
           <w:rFonts w:ascii="Times New Roman" w:hAnsi="Times New Roman" w:cs="Times New Roman"/>
@@ -18060,7 +19290,7 @@
         </w:rPr>
         <w:t>ử lý dữ liệu</w:t>
       </w:r>
-      <w:bookmarkEnd w:id="38"/>
+      <w:bookmarkEnd w:id="37"/>
     </w:p>
     <w:p>
       <w:pPr>
@@ -18073,14 +19303,14 @@
           <w:rFonts w:ascii="Times New Roman" w:hAnsi="Times New Roman" w:cs="Times New Roman"/>
         </w:rPr>
       </w:pPr>
-      <w:bookmarkStart w:id="39" w:name="_Toc232240926"/>
+      <w:bookmarkStart w:id="38" w:name="_Toc232240926"/>
       <w:r>
         <w:rPr>
           <w:rFonts w:ascii="Times New Roman" w:hAnsi="Times New Roman" w:cs="Times New Roman"/>
         </w:rPr>
         <w:t>Chuẩn hóa dữ liệu</w:t>
       </w:r>
-      <w:bookmarkEnd w:id="39"/>
+      <w:bookmarkEnd w:id="38"/>
     </w:p>
     <w:p>
       <w:pPr>
@@ -18251,15 +19481,14 @@
           <w:rFonts w:ascii="Times New Roman" w:hAnsi="Times New Roman" w:cs="Times New Roman"/>
         </w:rPr>
       </w:pPr>
-      <w:bookmarkStart w:id="40" w:name="_Toc232240927"/>
+      <w:bookmarkStart w:id="39" w:name="_Toc232240927"/>
       <w:r>
         <w:rPr>
           <w:rFonts w:ascii="Times New Roman" w:hAnsi="Times New Roman" w:cs="Times New Roman"/>
         </w:rPr>
-        <w:lastRenderedPageBreak/>
         <w:t>Trình bày các bước chuẩn hóa trong dự án</w:t>
       </w:r>
-      <w:bookmarkEnd w:id="40"/>
+      <w:bookmarkEnd w:id="39"/>
     </w:p>
     <w:p>
       <w:pPr>
@@ -18401,7 +19630,31 @@
         <w:rPr>
           <w:lang w:val="en-US"/>
         </w:rPr>
-        <w:t>Client ID $\rightarrow$ client_id</w:t>
+        <w:t>Client ID </w:t>
+      </w:r>
+      <m:oMath>
+        <m:r>
+          <m:rPr>
+            <m:sty m:val="p"/>
+          </m:rPr>
+          <w:rPr>
+            <w:rFonts w:ascii="Cambria Math" w:hAnsi="Cambria Math"/>
+            <w:lang w:val="en-US"/>
+          </w:rPr>
+          <m:t>→</m:t>
+        </m:r>
+      </m:oMath>
+      <w:r>
+        <w:rPr>
+          <w:rFonts w:eastAsiaTheme="minorEastAsia"/>
+        </w:rPr>
+        <w:t xml:space="preserve"> </w:t>
+      </w:r>
+      <w:r>
+        <w:rPr>
+          <w:lang w:val="en-US"/>
+        </w:rPr>
+        <w:t>client_id</w:t>
       </w:r>
     </w:p>
     <w:p>
@@ -18418,7 +19671,35 @@
         <w:rPr>
           <w:lang w:val="en-US"/>
         </w:rPr>
-        <w:t>Person Age $\rightarrow$ person_age</w:t>
+        <w:t>Person Age </w:t>
+      </w:r>
+      <m:oMath>
+        <m:r>
+          <m:rPr>
+            <m:sty m:val="p"/>
+          </m:rPr>
+          <w:rPr>
+            <w:rFonts w:ascii="Cambria Math" w:hAnsi="Cambria Math"/>
+            <w:lang w:val="en-US"/>
+          </w:rPr>
+          <m:t>→</m:t>
+        </m:r>
+        <m:r>
+          <m:rPr>
+            <m:sty m:val="p"/>
+          </m:rPr>
+          <w:rPr>
+            <w:rFonts w:ascii="Cambria Math" w:hAnsi="Cambria Math"/>
+            <w:lang w:val="en-US"/>
+          </w:rPr>
+          <m:t xml:space="preserve"> </m:t>
+        </m:r>
+      </m:oMath>
+      <w:r>
+        <w:rPr>
+          <w:lang w:val="en-US"/>
+        </w:rPr>
+        <w:t>person_age</w:t>
       </w:r>
     </w:p>
     <w:p>
@@ -18435,7 +19716,35 @@
         <w:rPr>
           <w:lang w:val="en-US"/>
         </w:rPr>
-        <w:t>Loan Amount $\rightarrow$ loan_amnt</w:t>
+        <w:t>Loan Amount </w:t>
+      </w:r>
+      <m:oMath>
+        <m:r>
+          <m:rPr>
+            <m:sty m:val="p"/>
+          </m:rPr>
+          <w:rPr>
+            <w:rFonts w:ascii="Cambria Math" w:hAnsi="Cambria Math"/>
+            <w:lang w:val="en-US"/>
+          </w:rPr>
+          <m:t>→</m:t>
+        </m:r>
+        <m:r>
+          <m:rPr>
+            <m:sty m:val="p"/>
+          </m:rPr>
+          <w:rPr>
+            <w:rFonts w:ascii="Cambria Math" w:hAnsi="Cambria Math"/>
+            <w:lang w:val="en-US"/>
+          </w:rPr>
+          <m:t xml:space="preserve"> </m:t>
+        </m:r>
+      </m:oMath>
+      <w:r>
+        <w:rPr>
+          <w:lang w:val="en-US"/>
+        </w:rPr>
+        <w:t>loan_amnt</w:t>
       </w:r>
     </w:p>
     <w:p>
@@ -18452,7 +19761,35 @@
         <w:rPr>
           <w:lang w:val="en-US"/>
         </w:rPr>
-        <w:t>Debt-to-Income Ratio $\rightarrow$ debt_to_income_ratio</w:t>
+        <w:t>Debt-to-Income Ratio </w:t>
+      </w:r>
+      <m:oMath>
+        <m:r>
+          <m:rPr>
+            <m:sty m:val="p"/>
+          </m:rPr>
+          <w:rPr>
+            <w:rFonts w:ascii="Cambria Math" w:hAnsi="Cambria Math"/>
+            <w:lang w:val="en-US"/>
+          </w:rPr>
+          <m:t>→</m:t>
+        </m:r>
+        <m:r>
+          <m:rPr>
+            <m:sty m:val="p"/>
+          </m:rPr>
+          <w:rPr>
+            <w:rFonts w:ascii="Cambria Math" w:hAnsi="Cambria Math"/>
+            <w:lang w:val="en-US"/>
+          </w:rPr>
+          <m:t xml:space="preserve"> </m:t>
+        </m:r>
+      </m:oMath>
+      <w:r>
+        <w:rPr>
+          <w:lang w:val="en-US"/>
+        </w:rPr>
+        <w:t>debt_to_income_ratio</w:t>
       </w:r>
     </w:p>
     <w:p>
@@ -18602,8 +19939,20 @@
           <w:lang w:val="en-US"/>
         </w:rPr>
         <w:lastRenderedPageBreak/>
-        <w:t>person_income, loan_amnt, other_debt $\rightarrow$ </w:t>
-      </w:r>
+        <w:t>person_income, loan_amnt, other_debt </w:t>
+      </w:r>
+      <m:oMath>
+        <m:r>
+          <m:rPr>
+            <m:sty m:val="p"/>
+          </m:rPr>
+          <w:rPr>
+            <w:rFonts w:ascii="Cambria Math" w:hAnsi="Cambria Math"/>
+            <w:lang w:val="en-US"/>
+          </w:rPr>
+          <m:t>→</m:t>
+        </m:r>
+      </m:oMath>
       <w:proofErr w:type="gramStart"/>
       <w:r>
         <w:rPr>
@@ -18633,8 +19982,30 @@
         <w:rPr>
           <w:lang w:val="en-US"/>
         </w:rPr>
-        <w:t>loan_int_rate $\rightarrow$ </w:t>
-      </w:r>
+        <w:t>loan_int_rate </w:t>
+      </w:r>
+      <m:oMath>
+        <m:r>
+          <m:rPr>
+            <m:sty m:val="p"/>
+          </m:rPr>
+          <w:rPr>
+            <w:rFonts w:ascii="Cambria Math" w:hAnsi="Cambria Math"/>
+            <w:lang w:val="en-US"/>
+          </w:rPr>
+          <m:t>→</m:t>
+        </m:r>
+        <m:r>
+          <m:rPr>
+            <m:sty m:val="p"/>
+          </m:rPr>
+          <w:rPr>
+            <w:rFonts w:ascii="Cambria Math" w:hAnsi="Cambria Math"/>
+            <w:lang w:val="en-US"/>
+          </w:rPr>
+          <m:t xml:space="preserve"> </m:t>
+        </m:r>
+      </m:oMath>
       <w:proofErr w:type="gramStart"/>
       <w:r>
         <w:rPr>
@@ -18664,8 +20035,30 @@
         <w:rPr>
           <w:lang w:val="en-US"/>
         </w:rPr>
-        <w:t>loan_percent_income, debt_to_income_ratio $\rightarrow$ </w:t>
-      </w:r>
+        <w:t>loan_percent_income, debt_to_income_ratio </w:t>
+      </w:r>
+      <m:oMath>
+        <m:r>
+          <m:rPr>
+            <m:sty m:val="p"/>
+          </m:rPr>
+          <w:rPr>
+            <w:rFonts w:ascii="Cambria Math" w:hAnsi="Cambria Math"/>
+            <w:lang w:val="en-US"/>
+          </w:rPr>
+          <m:t>→</m:t>
+        </m:r>
+        <m:r>
+          <m:rPr>
+            <m:sty m:val="p"/>
+          </m:rPr>
+          <w:rPr>
+            <w:rFonts w:ascii="Cambria Math" w:hAnsi="Cambria Math"/>
+            <w:lang w:val="en-US"/>
+          </w:rPr>
+          <m:t xml:space="preserve"> </m:t>
+        </m:r>
+      </m:oMath>
       <w:proofErr w:type="gramStart"/>
       <w:r>
         <w:rPr>
@@ -18703,7 +20096,34 @@
         <w:rPr>
           <w:lang w:val="en-US"/>
         </w:rPr>
-        <w:t> Đưa các trường phân loại chữ về độ dài giới hạn cố định để tối ưu vùng nhớ: loan_grade $\rightarrow$ </w:t>
+        <w:t> Đưa các trường phân loại chữ về độ dài giới hạn cố định để tối ưu vùng nhớ: </w:t>
+      </w:r>
+      <w:r>
+        <w:t xml:space="preserve"> </w:t>
+      </w:r>
+      <w:r>
+        <w:rPr>
+          <w:lang w:val="en-US"/>
+        </w:rPr>
+        <w:t>loan_grade </w:t>
+      </w:r>
+      <m:oMath>
+        <m:r>
+          <m:rPr>
+            <m:sty m:val="p"/>
+          </m:rPr>
+          <w:rPr>
+            <w:rFonts w:ascii="Cambria Math" w:hAnsi="Cambria Math"/>
+            <w:lang w:val="en-US"/>
+          </w:rPr>
+          <m:t>→</m:t>
+        </m:r>
+      </m:oMath>
+      <w:r>
+        <w:rPr>
+          <w:lang w:val="en-US"/>
+        </w:rPr>
+        <w:t> </w:t>
       </w:r>
       <w:proofErr w:type="gramStart"/>
       <w:r>
@@ -18717,8 +20137,37 @@
         <w:rPr>
           <w:lang w:val="en-US"/>
         </w:rPr>
-        <w:t>5), cb_person_default_on_file $\rightarrow$ </w:t>
-      </w:r>
+        <w:t>5), cb_person_default_on_</w:t>
+      </w:r>
+      <m:oMath>
+        <m:r>
+          <w:rPr>
+            <w:rFonts w:ascii="Cambria Math" w:hAnsi="Cambria Math"/>
+            <w:lang w:val="en-US"/>
+          </w:rPr>
+          <m:t xml:space="preserve"> </m:t>
+        </m:r>
+        <m:r>
+          <m:rPr>
+            <m:sty m:val="p"/>
+          </m:rPr>
+          <w:rPr>
+            <w:rFonts w:ascii="Cambria Math" w:hAnsi="Cambria Math"/>
+            <w:lang w:val="en-US"/>
+          </w:rPr>
+          <m:t>→</m:t>
+        </m:r>
+        <m:r>
+          <m:rPr>
+            <m:sty m:val="p"/>
+          </m:rPr>
+          <w:rPr>
+            <w:rFonts w:ascii="Cambria Math" w:hAnsi="Cambria Math"/>
+            <w:lang w:val="en-US"/>
+          </w:rPr>
+          <m:t xml:space="preserve"> </m:t>
+        </m:r>
+      </m:oMath>
       <w:proofErr w:type="gramStart"/>
       <w:r>
         <w:rPr>
@@ -19120,14 +20569,14 @@
           <w:rFonts w:ascii="Times New Roman" w:hAnsi="Times New Roman" w:cs="Times New Roman"/>
         </w:rPr>
       </w:pPr>
-      <w:bookmarkStart w:id="41" w:name="_Toc232240928"/>
+      <w:bookmarkStart w:id="40" w:name="_Toc232240928"/>
       <w:r>
         <w:rPr>
           <w:rFonts w:ascii="Times New Roman" w:hAnsi="Times New Roman" w:cs="Times New Roman"/>
         </w:rPr>
         <w:t>Mô hình hóa dữ liệu</w:t>
       </w:r>
-      <w:bookmarkEnd w:id="41"/>
+      <w:bookmarkEnd w:id="40"/>
     </w:p>
     <w:p>
       <w:pPr>
@@ -19783,7 +21232,7 @@
                     <pic:cNvPicPr/>
                   </pic:nvPicPr>
                   <pic:blipFill>
-                    <a:blip r:embed="rId15"/>
+                    <a:blip r:embed="rId16"/>
                     <a:stretch>
                       <a:fillRect/>
                     </a:stretch>
@@ -19815,7 +21264,7 @@
           <w:rFonts w:ascii="Times New Roman" w:hAnsi="Times New Roman" w:cs="Times New Roman"/>
         </w:rPr>
       </w:pPr>
-      <w:bookmarkStart w:id="42" w:name="_Toc232240930"/>
+      <w:bookmarkStart w:id="41" w:name="_Toc232240930"/>
       <w:r>
         <w:rPr>
           <w:rFonts w:ascii="Times New Roman" w:hAnsi="Times New Roman" w:cs="Times New Roman"/>
@@ -19828,7 +21277,7 @@
         </w:rPr>
         <w:t>ác tiêu chí đánh giá mô hình dữ liệu</w:t>
       </w:r>
-      <w:bookmarkEnd w:id="42"/>
+      <w:bookmarkEnd w:id="41"/>
     </w:p>
     <w:p>
       <w:pPr>
@@ -20099,14 +21548,14 @@
           <w:rFonts w:ascii="Times New Roman" w:hAnsi="Times New Roman" w:cs="Times New Roman"/>
         </w:rPr>
       </w:pPr>
-      <w:bookmarkStart w:id="43" w:name="_Toc232240931"/>
+      <w:bookmarkStart w:id="42" w:name="_Toc232240931"/>
       <w:r>
         <w:rPr>
           <w:rFonts w:ascii="Times New Roman" w:hAnsi="Times New Roman" w:cs="Times New Roman"/>
         </w:rPr>
         <w:t>Trình bày các bước mô hình hóa</w:t>
       </w:r>
-      <w:bookmarkEnd w:id="43"/>
+      <w:bookmarkEnd w:id="42"/>
     </w:p>
     <w:p>
       <w:pPr>
@@ -20758,7 +22207,7 @@
           <w:szCs w:val="24"/>
         </w:rPr>
       </w:pPr>
-      <w:bookmarkStart w:id="44" w:name="_Toc232240932"/>
+      <w:bookmarkStart w:id="43" w:name="_Toc232240932"/>
       <w:r>
         <w:rPr>
           <w:rFonts w:cs="Times New Roman"/>
@@ -20784,7 +22233,7 @@
         <w:lastRenderedPageBreak/>
         <w:t>Trình bày các bước tạo bảng dữ liệu</w:t>
       </w:r>
-      <w:bookmarkEnd w:id="44"/>
+      <w:bookmarkEnd w:id="43"/>
     </w:p>
     <w:p>
       <w:pPr>
@@ -21056,7 +22505,7 @@
                     <pic:cNvPicPr/>
                   </pic:nvPicPr>
                   <pic:blipFill>
-                    <a:blip r:embed="rId16"/>
+                    <a:blip r:embed="rId17"/>
                     <a:stretch>
                       <a:fillRect/>
                     </a:stretch>
@@ -21875,7 +23324,7 @@
                     <pic:cNvPicPr/>
                   </pic:nvPicPr>
                   <pic:blipFill>
-                    <a:blip r:embed="rId17"/>
+                    <a:blip r:embed="rId18"/>
                     <a:stretch>
                       <a:fillRect/>
                     </a:stretch>
@@ -22008,7 +23457,7 @@
           <w:lang w:val="en-US"/>
         </w:rPr>
       </w:pPr>
-      <w:bookmarkStart w:id="45" w:name="_Toc232240933"/>
+      <w:bookmarkStart w:id="44" w:name="_Toc232240933"/>
     </w:p>
     <w:p>
       <w:pPr>
@@ -22027,7 +23476,7 @@
         </w:rPr>
         <w:t>Xử lý dữ liệu DAX</w:t>
       </w:r>
-      <w:bookmarkEnd w:id="45"/>
+      <w:bookmarkEnd w:id="44"/>
     </w:p>
     <w:p>
       <w:pPr>
@@ -22160,7 +23609,7 @@
                     <pic:cNvPicPr/>
                   </pic:nvPicPr>
                   <pic:blipFill>
-                    <a:blip r:embed="rId18"/>
+                    <a:blip r:embed="rId19"/>
                     <a:stretch>
                       <a:fillRect/>
                     </a:stretch>
@@ -22229,7 +23678,7 @@
                     <pic:cNvPicPr/>
                   </pic:nvPicPr>
                   <pic:blipFill>
-                    <a:blip r:embed="rId19"/>
+                    <a:blip r:embed="rId20"/>
                     <a:stretch>
                       <a:fillRect/>
                     </a:stretch>
@@ -22261,14 +23710,14 @@
           <w:rFonts w:ascii="Times New Roman" w:hAnsi="Times New Roman" w:cs="Times New Roman"/>
         </w:rPr>
       </w:pPr>
-      <w:bookmarkStart w:id="46" w:name="_Toc232240934"/>
+      <w:bookmarkStart w:id="45" w:name="_Toc232240934"/>
       <w:r>
         <w:rPr>
           <w:rFonts w:ascii="Times New Roman" w:hAnsi="Times New Roman" w:cs="Times New Roman"/>
         </w:rPr>
         <w:t>Measure</w:t>
       </w:r>
-      <w:bookmarkEnd w:id="46"/>
+      <w:bookmarkEnd w:id="45"/>
     </w:p>
     <w:p>
       <w:pPr>
@@ -22489,7 +23938,7 @@
           <w:rFonts w:ascii="Times New Roman" w:hAnsi="Times New Roman" w:cs="Times New Roman"/>
         </w:rPr>
       </w:pPr>
-      <w:bookmarkStart w:id="47" w:name="_Toc232240935"/>
+      <w:bookmarkStart w:id="46" w:name="_Toc232240935"/>
       <w:r>
         <w:rPr>
           <w:rFonts w:ascii="Times New Roman" w:hAnsi="Times New Roman" w:cs="Times New Roman"/>
@@ -22502,7 +23951,7 @@
         </w:rPr>
         <w:t>alculated column</w:t>
       </w:r>
-      <w:bookmarkEnd w:id="47"/>
+      <w:bookmarkEnd w:id="46"/>
     </w:p>
     <w:p>
       <w:pPr>
@@ -22655,14 +24104,14 @@
           <w:rFonts w:ascii="Times New Roman" w:hAnsi="Times New Roman" w:cs="Times New Roman"/>
         </w:rPr>
       </w:pPr>
-      <w:bookmarkStart w:id="48" w:name="_Toc232240936"/>
+      <w:bookmarkStart w:id="47" w:name="_Toc232240936"/>
       <w:r>
         <w:rPr>
           <w:rFonts w:ascii="Times New Roman" w:hAnsi="Times New Roman" w:cs="Times New Roman"/>
         </w:rPr>
         <w:t>Filter</w:t>
       </w:r>
-      <w:bookmarkEnd w:id="48"/>
+      <w:bookmarkEnd w:id="47"/>
     </w:p>
     <w:p>
       <w:pPr>
@@ -22833,7 +24282,7 @@
           <w:rFonts w:ascii="Times New Roman" w:hAnsi="Times New Roman" w:cs="Times New Roman"/>
         </w:rPr>
       </w:pPr>
-      <w:bookmarkStart w:id="49" w:name="_Toc232240937"/>
+      <w:bookmarkStart w:id="48" w:name="_Toc232240937"/>
       <w:r>
         <w:rPr>
           <w:rFonts w:ascii="Times New Roman" w:hAnsi="Times New Roman" w:cs="Times New Roman"/>
@@ -22846,7 +24295,7 @@
         </w:rPr>
         <w:t>rực quan hóa dữ liệu</w:t>
       </w:r>
-      <w:bookmarkEnd w:id="49"/>
+      <w:bookmarkEnd w:id="48"/>
     </w:p>
     <w:p>
       <w:pPr>
@@ -22859,14 +24308,14 @@
           <w:rFonts w:ascii="Times New Roman" w:hAnsi="Times New Roman" w:cs="Times New Roman"/>
         </w:rPr>
       </w:pPr>
-      <w:bookmarkStart w:id="50" w:name="_Toc232240938"/>
+      <w:bookmarkStart w:id="49" w:name="_Toc232240938"/>
       <w:r>
         <w:rPr>
           <w:rFonts w:ascii="Times New Roman" w:hAnsi="Times New Roman" w:cs="Times New Roman"/>
         </w:rPr>
         <w:t>Các kỹ thuật trực quan hóa</w:t>
       </w:r>
-      <w:bookmarkEnd w:id="50"/>
+      <w:bookmarkEnd w:id="49"/>
     </w:p>
     <w:p>
       <w:pPr>
@@ -22963,7 +24412,7 @@
           <w:rFonts w:ascii="Times New Roman" w:hAnsi="Times New Roman" w:cs="Times New Roman"/>
         </w:rPr>
       </w:pPr>
-      <w:bookmarkStart w:id="51" w:name="_Toc232240939"/>
+      <w:bookmarkStart w:id="50" w:name="_Toc232240939"/>
       <w:r>
         <w:rPr>
           <w:rFonts w:ascii="Times New Roman" w:hAnsi="Times New Roman" w:cs="Times New Roman"/>
@@ -22976,7 +24425,7 @@
         </w:rPr>
         <w:t xml:space="preserve"> trực quan hóa</w:t>
       </w:r>
-      <w:bookmarkEnd w:id="51"/>
+      <w:bookmarkEnd w:id="50"/>
     </w:p>
     <w:p>
       <w:pPr>
@@ -23072,14 +24521,14 @@
           <w:rFonts w:ascii="Times New Roman" w:hAnsi="Times New Roman" w:cs="Times New Roman"/>
         </w:rPr>
       </w:pPr>
-      <w:bookmarkStart w:id="52" w:name="_Toc232240940"/>
+      <w:bookmarkStart w:id="51" w:name="_Toc232240940"/>
       <w:r>
         <w:rPr>
           <w:rFonts w:ascii="Times New Roman" w:hAnsi="Times New Roman" w:cs="Times New Roman"/>
         </w:rPr>
         <w:t>Trình bày cách thêm visual mới</w:t>
       </w:r>
-      <w:bookmarkEnd w:id="52"/>
+      <w:bookmarkEnd w:id="51"/>
     </w:p>
     <w:p>
       <w:pPr>
@@ -23229,14 +24678,14 @@
           <w:rFonts w:ascii="Times New Roman" w:hAnsi="Times New Roman" w:cs="Times New Roman"/>
         </w:rPr>
       </w:pPr>
-      <w:bookmarkStart w:id="53" w:name="_Toc232240941"/>
+      <w:bookmarkStart w:id="52" w:name="_Toc232240941"/>
       <w:r>
         <w:rPr>
           <w:rFonts w:ascii="Times New Roman" w:hAnsi="Times New Roman" w:cs="Times New Roman"/>
         </w:rPr>
         <w:t>Trình bày tạo các report cho dự án</w:t>
       </w:r>
-      <w:bookmarkEnd w:id="53"/>
+      <w:bookmarkEnd w:id="52"/>
     </w:p>
     <w:p>
       <w:pPr>
@@ -23361,14 +24810,14 @@
           <w:rFonts w:ascii="Times New Roman" w:hAnsi="Times New Roman" w:cs="Times New Roman"/>
         </w:rPr>
       </w:pPr>
-      <w:bookmarkStart w:id="54" w:name="_Toc232240942"/>
+      <w:bookmarkStart w:id="53" w:name="_Toc232240942"/>
       <w:r>
         <w:rPr>
           <w:rFonts w:ascii="Times New Roman" w:hAnsi="Times New Roman" w:cs="Times New Roman"/>
         </w:rPr>
         <w:t>Tạo visual thống kê chi tiết</w:t>
       </w:r>
-      <w:bookmarkEnd w:id="54"/>
+      <w:bookmarkEnd w:id="53"/>
     </w:p>
     <w:p>
       <w:pPr>
@@ -23580,14 +25029,14 @@
           <w:rFonts w:ascii="Times New Roman" w:hAnsi="Times New Roman" w:cs="Times New Roman"/>
         </w:rPr>
       </w:pPr>
-      <w:bookmarkStart w:id="55" w:name="_Toc232240943"/>
+      <w:bookmarkStart w:id="54" w:name="_Toc232240943"/>
       <w:r>
         <w:rPr>
           <w:rFonts w:ascii="Times New Roman" w:hAnsi="Times New Roman" w:cs="Times New Roman"/>
         </w:rPr>
         <w:t>Tạo visual thống kê tổng thể</w:t>
       </w:r>
-      <w:bookmarkEnd w:id="55"/>
+      <w:bookmarkEnd w:id="54"/>
     </w:p>
     <w:p>
       <w:pPr>
@@ -23804,7 +25253,7 @@
           <w:rFonts w:ascii="Times New Roman" w:hAnsi="Times New Roman" w:cs="Times New Roman"/>
         </w:rPr>
       </w:pPr>
-      <w:bookmarkStart w:id="56" w:name="_Toc232240944"/>
+      <w:bookmarkStart w:id="55" w:name="_Toc232240944"/>
       <w:r>
         <w:rPr>
           <w:rFonts w:ascii="Times New Roman" w:hAnsi="Times New Roman" w:cs="Times New Roman"/>
@@ -23817,7 +25266,7 @@
         </w:rPr>
         <w:t>ây dựng báo cáo</w:t>
       </w:r>
-      <w:bookmarkEnd w:id="56"/>
+      <w:bookmarkEnd w:id="55"/>
     </w:p>
     <w:p>
       <w:pPr>
@@ -23830,14 +25279,14 @@
           <w:rFonts w:ascii="Times New Roman" w:hAnsi="Times New Roman" w:cs="Times New Roman"/>
         </w:rPr>
       </w:pPr>
-      <w:bookmarkStart w:id="57" w:name="_Toc232240945"/>
+      <w:bookmarkStart w:id="56" w:name="_Toc232240945"/>
       <w:r>
         <w:rPr>
           <w:rFonts w:ascii="Times New Roman" w:hAnsi="Times New Roman" w:cs="Times New Roman"/>
         </w:rPr>
         <w:t>Dashboard và report</w:t>
       </w:r>
-      <w:bookmarkEnd w:id="57"/>
+      <w:bookmarkEnd w:id="56"/>
     </w:p>
     <w:p>
       <w:pPr>
@@ -23930,14 +25379,14 @@
           <w:rFonts w:ascii="Times New Roman" w:hAnsi="Times New Roman" w:cs="Times New Roman"/>
         </w:rPr>
       </w:pPr>
-      <w:bookmarkStart w:id="58" w:name="_Toc232240946"/>
+      <w:bookmarkStart w:id="57" w:name="_Toc232240946"/>
       <w:r>
         <w:rPr>
           <w:rFonts w:ascii="Times New Roman" w:hAnsi="Times New Roman" w:cs="Times New Roman"/>
         </w:rPr>
         <w:t>Xây dựng báo cáo</w:t>
       </w:r>
-      <w:bookmarkEnd w:id="58"/>
+      <w:bookmarkEnd w:id="57"/>
     </w:p>
     <w:p>
       <w:pPr>
@@ -24016,14 +25465,14 @@
           <w:rFonts w:ascii="Times New Roman" w:hAnsi="Times New Roman" w:cs="Times New Roman"/>
         </w:rPr>
       </w:pPr>
-      <w:bookmarkStart w:id="59" w:name="_Toc232240947"/>
+      <w:bookmarkStart w:id="58" w:name="_Toc232240947"/>
       <w:r>
         <w:rPr>
           <w:rFonts w:ascii="Times New Roman" w:hAnsi="Times New Roman" w:cs="Times New Roman"/>
         </w:rPr>
         <w:t>Dashboard vs Report</w:t>
       </w:r>
-      <w:bookmarkEnd w:id="59"/>
+      <w:bookmarkEnd w:id="58"/>
     </w:p>
     <w:p>
       <w:pPr>
@@ -24118,14 +25567,14 @@
           <w:rFonts w:ascii="Times New Roman" w:hAnsi="Times New Roman" w:cs="Times New Roman"/>
         </w:rPr>
       </w:pPr>
-      <w:bookmarkStart w:id="60" w:name="_Toc232240948"/>
+      <w:bookmarkStart w:id="59" w:name="_Toc232240948"/>
       <w:r>
         <w:rPr>
           <w:rFonts w:ascii="Times New Roman" w:hAnsi="Times New Roman" w:cs="Times New Roman"/>
         </w:rPr>
         <w:t>Dashboard</w:t>
       </w:r>
-      <w:bookmarkEnd w:id="60"/>
+      <w:bookmarkEnd w:id="59"/>
     </w:p>
     <w:p>
       <w:pPr>
@@ -24228,7 +25677,7 @@
           <w:rFonts w:ascii="Times New Roman" w:hAnsi="Times New Roman" w:cs="Times New Roman"/>
         </w:rPr>
       </w:pPr>
-      <w:bookmarkStart w:id="61" w:name="_Toc232240949"/>
+      <w:bookmarkStart w:id="60" w:name="_Toc232240949"/>
       <w:r>
         <w:rPr>
           <w:rFonts w:ascii="Times New Roman" w:hAnsi="Times New Roman" w:cs="Times New Roman"/>
@@ -24236,7 +25685,7 @@
         <w:lastRenderedPageBreak/>
         <w:t>Report</w:t>
       </w:r>
-      <w:bookmarkEnd w:id="61"/>
+      <w:bookmarkEnd w:id="60"/>
     </w:p>
     <w:p>
       <w:pPr>
@@ -24457,14 +25906,14 @@
           <w:rFonts w:ascii="Times New Roman" w:hAnsi="Times New Roman" w:cs="Times New Roman"/>
         </w:rPr>
       </w:pPr>
-      <w:bookmarkStart w:id="62" w:name="_Toc232240950"/>
+      <w:bookmarkStart w:id="61" w:name="_Toc232240950"/>
       <w:r>
         <w:rPr>
           <w:rFonts w:ascii="Times New Roman" w:hAnsi="Times New Roman" w:cs="Times New Roman"/>
         </w:rPr>
         <w:t>Bookmark</w:t>
       </w:r>
-      <w:bookmarkEnd w:id="62"/>
+      <w:bookmarkEnd w:id="61"/>
     </w:p>
     <w:p>
       <w:pPr>
@@ -24812,7 +26261,7 @@
           <w:rFonts w:ascii="Times New Roman" w:hAnsi="Times New Roman" w:cs="Times New Roman"/>
         </w:rPr>
       </w:pPr>
-      <w:bookmarkStart w:id="63" w:name="_Toc232240951"/>
+      <w:bookmarkStart w:id="62" w:name="_Toc232240951"/>
       <w:r>
         <w:rPr>
           <w:rFonts w:ascii="Times New Roman" w:hAnsi="Times New Roman" w:cs="Times New Roman"/>
@@ -24825,7 +26274,7 @@
         </w:rPr>
         <w:t>ẾT LUẬN</w:t>
       </w:r>
-      <w:bookmarkEnd w:id="63"/>
+      <w:bookmarkEnd w:id="62"/>
     </w:p>
     <w:p>
       <w:pPr>
@@ -24838,14 +26287,14 @@
           <w:rFonts w:ascii="Times New Roman" w:hAnsi="Times New Roman" w:cs="Times New Roman"/>
         </w:rPr>
       </w:pPr>
-      <w:bookmarkStart w:id="64" w:name="_Toc232240952"/>
+      <w:bookmarkStart w:id="63" w:name="_Toc232240952"/>
       <w:r>
         <w:rPr>
           <w:rFonts w:ascii="Times New Roman" w:hAnsi="Times New Roman" w:cs="Times New Roman"/>
         </w:rPr>
         <w:t>Báo cáo</w:t>
       </w:r>
-      <w:bookmarkEnd w:id="64"/>
+      <w:bookmarkEnd w:id="63"/>
     </w:p>
     <w:p>
       <w:pPr>
@@ -24858,14 +26307,14 @@
           <w:rFonts w:ascii="Times New Roman" w:hAnsi="Times New Roman" w:cs="Times New Roman"/>
         </w:rPr>
       </w:pPr>
-      <w:bookmarkStart w:id="65" w:name="_Toc232240953"/>
+      <w:bookmarkStart w:id="64" w:name="_Toc232240953"/>
       <w:r>
         <w:rPr>
           <w:rFonts w:ascii="Times New Roman" w:hAnsi="Times New Roman" w:cs="Times New Roman"/>
         </w:rPr>
         <w:t>Các bước viết báo cáo</w:t>
       </w:r>
-      <w:bookmarkEnd w:id="65"/>
+      <w:bookmarkEnd w:id="64"/>
     </w:p>
     <w:p>
       <w:pPr>
@@ -24916,14 +26365,14 @@
           <w:rFonts w:ascii="Times New Roman" w:hAnsi="Times New Roman" w:cs="Times New Roman"/>
         </w:rPr>
       </w:pPr>
-      <w:bookmarkStart w:id="66" w:name="_Toc232240954"/>
+      <w:bookmarkStart w:id="65" w:name="_Toc232240954"/>
       <w:r>
         <w:rPr>
           <w:rFonts w:ascii="Times New Roman" w:hAnsi="Times New Roman" w:cs="Times New Roman"/>
         </w:rPr>
         <w:t>Tổng hợp</w:t>
       </w:r>
-      <w:bookmarkEnd w:id="66"/>
+      <w:bookmarkEnd w:id="65"/>
     </w:p>
     <w:p>
       <w:pPr>
@@ -24998,7 +26447,7 @@
           <w:rFonts w:ascii="Times New Roman" w:hAnsi="Times New Roman" w:cs="Times New Roman"/>
         </w:rPr>
       </w:pPr>
-      <w:bookmarkStart w:id="67" w:name="_Toc232240955"/>
+      <w:bookmarkStart w:id="66" w:name="_Toc232240955"/>
       <w:r>
         <w:rPr>
           <w:rFonts w:ascii="Times New Roman" w:hAnsi="Times New Roman" w:cs="Times New Roman"/>
@@ -25011,7 +26460,7 @@
         </w:rPr>
         <w:t>hó khăn</w:t>
       </w:r>
-      <w:bookmarkEnd w:id="67"/>
+      <w:bookmarkEnd w:id="66"/>
     </w:p>
     <w:p>
       <w:pPr>
@@ -25024,7 +26473,7 @@
           <w:rFonts w:ascii="Times New Roman" w:hAnsi="Times New Roman" w:cs="Times New Roman"/>
         </w:rPr>
       </w:pPr>
-      <w:bookmarkStart w:id="68" w:name="_Toc232240956"/>
+      <w:bookmarkStart w:id="67" w:name="_Toc232240956"/>
       <w:r>
         <w:rPr>
           <w:rFonts w:ascii="Times New Roman" w:hAnsi="Times New Roman" w:cs="Times New Roman"/>
@@ -25037,7 +26486,7 @@
         </w:rPr>
         <w:t>huận lợi</w:t>
       </w:r>
-      <w:bookmarkEnd w:id="68"/>
+      <w:bookmarkEnd w:id="67"/>
     </w:p>
     <w:p>
       <w:pPr>
@@ -25050,14 +26499,14 @@
           <w:rFonts w:ascii="Times New Roman" w:hAnsi="Times New Roman" w:cs="Times New Roman"/>
         </w:rPr>
       </w:pPr>
-      <w:bookmarkStart w:id="69" w:name="_Toc232240957"/>
+      <w:bookmarkStart w:id="68" w:name="_Toc232240957"/>
       <w:r>
         <w:rPr>
           <w:rFonts w:ascii="Times New Roman" w:hAnsi="Times New Roman" w:cs="Times New Roman"/>
         </w:rPr>
         <w:t>Hướng phát triển</w:t>
       </w:r>
-      <w:bookmarkEnd w:id="69"/>
+      <w:bookmarkEnd w:id="68"/>
     </w:p>
     <w:p>
       <w:pPr>
@@ -25067,8 +26516,8 @@
       </w:pPr>
     </w:p>
     <w:sectPr>
-      <w:headerReference w:type="default" r:id="rId20"/>
-      <w:footerReference w:type="default" r:id="rId21"/>
+      <w:headerReference w:type="default" r:id="rId21"/>
+      <w:footerReference w:type="default" r:id="rId22"/>
       <w:pgSz w:w="12240" w:h="15840"/>
       <w:pgMar w:top="1440" w:right="1440" w:bottom="1440" w:left="1440" w:header="720" w:footer="720" w:gutter="0"/>
       <w:pgBorders w:display="firstPage" w:offsetFrom="page">
@@ -27114,6 +28563,123 @@
     </w:lvl>
   </w:abstractNum>
   <w:abstractNum w:abstractNumId="14" w15:restartNumberingAfterBreak="0">
+    <w:nsid w:val="21FE3868"/>
+    <w:multiLevelType w:val="multilevel"/>
+    <w:tmpl w:val="352AF392"/>
+    <w:lvl w:ilvl="0">
+      <w:start w:val="1"/>
+      <w:numFmt w:val="decimal"/>
+      <w:lvlText w:val="%1."/>
+      <w:lvlJc w:val="left"/>
+      <w:pPr>
+        <w:tabs>
+          <w:tab w:val="num" w:pos="720"/>
+        </w:tabs>
+        <w:ind w:left="720" w:hanging="360"/>
+      </w:pPr>
+    </w:lvl>
+    <w:lvl w:ilvl="1">
+      <w:start w:val="1"/>
+      <w:numFmt w:val="bullet"/>
+      <w:lvlText w:val=""/>
+      <w:lvlJc w:val="left"/>
+      <w:pPr>
+        <w:tabs>
+          <w:tab w:val="num" w:pos="1440"/>
+        </w:tabs>
+        <w:ind w:left="1440" w:hanging="360"/>
+      </w:pPr>
+      <w:rPr>
+        <w:rFonts w:ascii="Symbol" w:hAnsi="Symbol" w:hint="default"/>
+        <w:sz w:val="20"/>
+      </w:rPr>
+    </w:lvl>
+    <w:lvl w:ilvl="2" w:tentative="1">
+      <w:start w:val="1"/>
+      <w:numFmt w:val="decimal"/>
+      <w:lvlText w:val="%3."/>
+      <w:lvlJc w:val="left"/>
+      <w:pPr>
+        <w:tabs>
+          <w:tab w:val="num" w:pos="2160"/>
+        </w:tabs>
+        <w:ind w:left="2160" w:hanging="360"/>
+      </w:pPr>
+    </w:lvl>
+    <w:lvl w:ilvl="3" w:tentative="1">
+      <w:start w:val="1"/>
+      <w:numFmt w:val="decimal"/>
+      <w:lvlText w:val="%4."/>
+      <w:lvlJc w:val="left"/>
+      <w:pPr>
+        <w:tabs>
+          <w:tab w:val="num" w:pos="2880"/>
+        </w:tabs>
+        <w:ind w:left="2880" w:hanging="360"/>
+      </w:pPr>
+    </w:lvl>
+    <w:lvl w:ilvl="4" w:tentative="1">
+      <w:start w:val="1"/>
+      <w:numFmt w:val="decimal"/>
+      <w:lvlText w:val="%5."/>
+      <w:lvlJc w:val="left"/>
+      <w:pPr>
+        <w:tabs>
+          <w:tab w:val="num" w:pos="3600"/>
+        </w:tabs>
+        <w:ind w:left="3600" w:hanging="360"/>
+      </w:pPr>
+    </w:lvl>
+    <w:lvl w:ilvl="5" w:tentative="1">
+      <w:start w:val="1"/>
+      <w:numFmt w:val="decimal"/>
+      <w:lvlText w:val="%6."/>
+      <w:lvlJc w:val="left"/>
+      <w:pPr>
+        <w:tabs>
+          <w:tab w:val="num" w:pos="4320"/>
+        </w:tabs>
+        <w:ind w:left="4320" w:hanging="360"/>
+      </w:pPr>
+    </w:lvl>
+    <w:lvl w:ilvl="6" w:tentative="1">
+      <w:start w:val="1"/>
+      <w:numFmt w:val="decimal"/>
+      <w:lvlText w:val="%7."/>
+      <w:lvlJc w:val="left"/>
+      <w:pPr>
+        <w:tabs>
+          <w:tab w:val="num" w:pos="5040"/>
+        </w:tabs>
+        <w:ind w:left="5040" w:hanging="360"/>
+      </w:pPr>
+    </w:lvl>
+    <w:lvl w:ilvl="7" w:tentative="1">
+      <w:start w:val="1"/>
+      <w:numFmt w:val="decimal"/>
+      <w:lvlText w:val="%8."/>
+      <w:lvlJc w:val="left"/>
+      <w:pPr>
+        <w:tabs>
+          <w:tab w:val="num" w:pos="5760"/>
+        </w:tabs>
+        <w:ind w:left="5760" w:hanging="360"/>
+      </w:pPr>
+    </w:lvl>
+    <w:lvl w:ilvl="8" w:tentative="1">
+      <w:start w:val="1"/>
+      <w:numFmt w:val="decimal"/>
+      <w:lvlText w:val="%9."/>
+      <w:lvlJc w:val="left"/>
+      <w:pPr>
+        <w:tabs>
+          <w:tab w:val="num" w:pos="6480"/>
+        </w:tabs>
+        <w:ind w:left="6480" w:hanging="360"/>
+      </w:pPr>
+    </w:lvl>
+  </w:abstractNum>
+  <w:abstractNum w:abstractNumId="15" w15:restartNumberingAfterBreak="0">
     <w:nsid w:val="275D4BDC"/>
     <w:multiLevelType w:val="multilevel"/>
     <w:tmpl w:val="140C588A"/>
@@ -27262,7 +28828,7 @@
       </w:rPr>
     </w:lvl>
   </w:abstractNum>
-  <w:abstractNum w:abstractNumId="15" w15:restartNumberingAfterBreak="0">
+  <w:abstractNum w:abstractNumId="16" w15:restartNumberingAfterBreak="0">
     <w:nsid w:val="2B3723A5"/>
     <w:multiLevelType w:val="multilevel"/>
     <w:tmpl w:val="3C54F354"/>
@@ -27411,7 +28977,156 @@
       </w:rPr>
     </w:lvl>
   </w:abstractNum>
-  <w:abstractNum w:abstractNumId="16" w15:restartNumberingAfterBreak="0">
+  <w:abstractNum w:abstractNumId="17" w15:restartNumberingAfterBreak="0">
+    <w:nsid w:val="2F411043"/>
+    <w:multiLevelType w:val="multilevel"/>
+    <w:tmpl w:val="11F2B802"/>
+    <w:lvl w:ilvl="0">
+      <w:start w:val="1"/>
+      <w:numFmt w:val="bullet"/>
+      <w:lvlText w:val=""/>
+      <w:lvlJc w:val="left"/>
+      <w:pPr>
+        <w:tabs>
+          <w:tab w:val="num" w:pos="720"/>
+        </w:tabs>
+        <w:ind w:left="720" w:hanging="360"/>
+      </w:pPr>
+      <w:rPr>
+        <w:rFonts w:ascii="Symbol" w:hAnsi="Symbol" w:hint="default"/>
+        <w:sz w:val="20"/>
+      </w:rPr>
+    </w:lvl>
+    <w:lvl w:ilvl="1" w:tentative="1">
+      <w:start w:val="1"/>
+      <w:numFmt w:val="bullet"/>
+      <w:lvlText w:val=""/>
+      <w:lvlJc w:val="left"/>
+      <w:pPr>
+        <w:tabs>
+          <w:tab w:val="num" w:pos="1440"/>
+        </w:tabs>
+        <w:ind w:left="1440" w:hanging="360"/>
+      </w:pPr>
+      <w:rPr>
+        <w:rFonts w:ascii="Symbol" w:hAnsi="Symbol" w:hint="default"/>
+        <w:sz w:val="20"/>
+      </w:rPr>
+    </w:lvl>
+    <w:lvl w:ilvl="2" w:tentative="1">
+      <w:start w:val="1"/>
+      <w:numFmt w:val="bullet"/>
+      <w:lvlText w:val=""/>
+      <w:lvlJc w:val="left"/>
+      <w:pPr>
+        <w:tabs>
+          <w:tab w:val="num" w:pos="2160"/>
+        </w:tabs>
+        <w:ind w:left="2160" w:hanging="360"/>
+      </w:pPr>
+      <w:rPr>
+        <w:rFonts w:ascii="Symbol" w:hAnsi="Symbol" w:hint="default"/>
+        <w:sz w:val="20"/>
+      </w:rPr>
+    </w:lvl>
+    <w:lvl w:ilvl="3" w:tentative="1">
+      <w:start w:val="1"/>
+      <w:numFmt w:val="bullet"/>
+      <w:lvlText w:val=""/>
+      <w:lvlJc w:val="left"/>
+      <w:pPr>
+        <w:tabs>
+          <w:tab w:val="num" w:pos="2880"/>
+        </w:tabs>
+        <w:ind w:left="2880" w:hanging="360"/>
+      </w:pPr>
+      <w:rPr>
+        <w:rFonts w:ascii="Symbol" w:hAnsi="Symbol" w:hint="default"/>
+        <w:sz w:val="20"/>
+      </w:rPr>
+    </w:lvl>
+    <w:lvl w:ilvl="4" w:tentative="1">
+      <w:start w:val="1"/>
+      <w:numFmt w:val="bullet"/>
+      <w:lvlText w:val=""/>
+      <w:lvlJc w:val="left"/>
+      <w:pPr>
+        <w:tabs>
+          <w:tab w:val="num" w:pos="3600"/>
+        </w:tabs>
+        <w:ind w:left="3600" w:hanging="360"/>
+      </w:pPr>
+      <w:rPr>
+        <w:rFonts w:ascii="Symbol" w:hAnsi="Symbol" w:hint="default"/>
+        <w:sz w:val="20"/>
+      </w:rPr>
+    </w:lvl>
+    <w:lvl w:ilvl="5" w:tentative="1">
+      <w:start w:val="1"/>
+      <w:numFmt w:val="bullet"/>
+      <w:lvlText w:val=""/>
+      <w:lvlJc w:val="left"/>
+      <w:pPr>
+        <w:tabs>
+          <w:tab w:val="num" w:pos="4320"/>
+        </w:tabs>
+        <w:ind w:left="4320" w:hanging="360"/>
+      </w:pPr>
+      <w:rPr>
+        <w:rFonts w:ascii="Symbol" w:hAnsi="Symbol" w:hint="default"/>
+        <w:sz w:val="20"/>
+      </w:rPr>
+    </w:lvl>
+    <w:lvl w:ilvl="6" w:tentative="1">
+      <w:start w:val="1"/>
+      <w:numFmt w:val="bullet"/>
+      <w:lvlText w:val=""/>
+      <w:lvlJc w:val="left"/>
+      <w:pPr>
+        <w:tabs>
+          <w:tab w:val="num" w:pos="5040"/>
+        </w:tabs>
+        <w:ind w:left="5040" w:hanging="360"/>
+      </w:pPr>
+      <w:rPr>
+        <w:rFonts w:ascii="Symbol" w:hAnsi="Symbol" w:hint="default"/>
+        <w:sz w:val="20"/>
+      </w:rPr>
+    </w:lvl>
+    <w:lvl w:ilvl="7" w:tentative="1">
+      <w:start w:val="1"/>
+      <w:numFmt w:val="bullet"/>
+      <w:lvlText w:val=""/>
+      <w:lvlJc w:val="left"/>
+      <w:pPr>
+        <w:tabs>
+          <w:tab w:val="num" w:pos="5760"/>
+        </w:tabs>
+        <w:ind w:left="5760" w:hanging="360"/>
+      </w:pPr>
+      <w:rPr>
+        <w:rFonts w:ascii="Symbol" w:hAnsi="Symbol" w:hint="default"/>
+        <w:sz w:val="20"/>
+      </w:rPr>
+    </w:lvl>
+    <w:lvl w:ilvl="8" w:tentative="1">
+      <w:start w:val="1"/>
+      <w:numFmt w:val="bullet"/>
+      <w:lvlText w:val=""/>
+      <w:lvlJc w:val="left"/>
+      <w:pPr>
+        <w:tabs>
+          <w:tab w:val="num" w:pos="6480"/>
+        </w:tabs>
+        <w:ind w:left="6480" w:hanging="360"/>
+      </w:pPr>
+      <w:rPr>
+        <w:rFonts w:ascii="Symbol" w:hAnsi="Symbol" w:hint="default"/>
+        <w:sz w:val="20"/>
+      </w:rPr>
+    </w:lvl>
+  </w:abstractNum>
+  <w:abstractNum w:abstractNumId="18" w15:restartNumberingAfterBreak="0">
     <w:nsid w:val="2FF75561"/>
     <w:multiLevelType w:val="multilevel"/>
     <w:tmpl w:val="A84CE242"/>
@@ -27532,7 +29247,7 @@
       </w:rPr>
     </w:lvl>
   </w:abstractNum>
-  <w:abstractNum w:abstractNumId="17" w15:restartNumberingAfterBreak="0">
+  <w:abstractNum w:abstractNumId="19" w15:restartNumberingAfterBreak="0">
     <w:nsid w:val="308B060B"/>
     <w:multiLevelType w:val="multilevel"/>
     <w:tmpl w:val="19D45030"/>
@@ -27681,13 +29396,130 @@
       </w:rPr>
     </w:lvl>
   </w:abstractNum>
-  <w:abstractNum w:abstractNumId="18" w15:restartNumberingAfterBreak="0">
+  <w:abstractNum w:abstractNumId="20" w15:restartNumberingAfterBreak="0">
     <w:nsid w:val="31084BE5"/>
     <w:multiLevelType w:val="multilevel"/>
     <w:tmpl w:val="87B00C80"/>
     <w:numStyleLink w:val="Style1"/>
   </w:abstractNum>
-  <w:abstractNum w:abstractNumId="19" w15:restartNumberingAfterBreak="0">
+  <w:abstractNum w:abstractNumId="21" w15:restartNumberingAfterBreak="0">
+    <w:nsid w:val="32B8744C"/>
+    <w:multiLevelType w:val="multilevel"/>
+    <w:tmpl w:val="91DC18B6"/>
+    <w:lvl w:ilvl="0">
+      <w:start w:val="1"/>
+      <w:numFmt w:val="decimal"/>
+      <w:lvlText w:val="%1."/>
+      <w:lvlJc w:val="left"/>
+      <w:pPr>
+        <w:tabs>
+          <w:tab w:val="num" w:pos="720"/>
+        </w:tabs>
+        <w:ind w:left="720" w:hanging="360"/>
+      </w:pPr>
+    </w:lvl>
+    <w:lvl w:ilvl="1">
+      <w:start w:val="1"/>
+      <w:numFmt w:val="bullet"/>
+      <w:lvlText w:val=""/>
+      <w:lvlJc w:val="left"/>
+      <w:pPr>
+        <w:tabs>
+          <w:tab w:val="num" w:pos="1440"/>
+        </w:tabs>
+        <w:ind w:left="1440" w:hanging="360"/>
+      </w:pPr>
+      <w:rPr>
+        <w:rFonts w:ascii="Symbol" w:hAnsi="Symbol" w:hint="default"/>
+        <w:sz w:val="20"/>
+      </w:rPr>
+    </w:lvl>
+    <w:lvl w:ilvl="2" w:tentative="1">
+      <w:start w:val="1"/>
+      <w:numFmt w:val="decimal"/>
+      <w:lvlText w:val="%3."/>
+      <w:lvlJc w:val="left"/>
+      <w:pPr>
+        <w:tabs>
+          <w:tab w:val="num" w:pos="2160"/>
+        </w:tabs>
+        <w:ind w:left="2160" w:hanging="360"/>
+      </w:pPr>
+    </w:lvl>
+    <w:lvl w:ilvl="3" w:tentative="1">
+      <w:start w:val="1"/>
+      <w:numFmt w:val="decimal"/>
+      <w:lvlText w:val="%4."/>
+      <w:lvlJc w:val="left"/>
+      <w:pPr>
+        <w:tabs>
+          <w:tab w:val="num" w:pos="2880"/>
+        </w:tabs>
+        <w:ind w:left="2880" w:hanging="360"/>
+      </w:pPr>
+    </w:lvl>
+    <w:lvl w:ilvl="4" w:tentative="1">
+      <w:start w:val="1"/>
+      <w:numFmt w:val="decimal"/>
+      <w:lvlText w:val="%5."/>
+      <w:lvlJc w:val="left"/>
+      <w:pPr>
+        <w:tabs>
+          <w:tab w:val="num" w:pos="3600"/>
+        </w:tabs>
+        <w:ind w:left="3600" w:hanging="360"/>
+      </w:pPr>
+    </w:lvl>
+    <w:lvl w:ilvl="5" w:tentative="1">
+      <w:start w:val="1"/>
+      <w:numFmt w:val="decimal"/>
+      <w:lvlText w:val="%6."/>
+      <w:lvlJc w:val="left"/>
+      <w:pPr>
+        <w:tabs>
+          <w:tab w:val="num" w:pos="4320"/>
+        </w:tabs>
+        <w:ind w:left="4320" w:hanging="360"/>
+      </w:pPr>
+    </w:lvl>
+    <w:lvl w:ilvl="6" w:tentative="1">
+      <w:start w:val="1"/>
+      <w:numFmt w:val="decimal"/>
+      <w:lvlText w:val="%7."/>
+      <w:lvlJc w:val="left"/>
+      <w:pPr>
+        <w:tabs>
+          <w:tab w:val="num" w:pos="5040"/>
+        </w:tabs>
+        <w:ind w:left="5040" w:hanging="360"/>
+      </w:pPr>
+    </w:lvl>
+    <w:lvl w:ilvl="7" w:tentative="1">
+      <w:start w:val="1"/>
+      <w:numFmt w:val="decimal"/>
+      <w:lvlText w:val="%8."/>
+      <w:lvlJc w:val="left"/>
+      <w:pPr>
+        <w:tabs>
+          <w:tab w:val="num" w:pos="5760"/>
+        </w:tabs>
+        <w:ind w:left="5760" w:hanging="360"/>
+      </w:pPr>
+    </w:lvl>
+    <w:lvl w:ilvl="8" w:tentative="1">
+      <w:start w:val="1"/>
+      <w:numFmt w:val="decimal"/>
+      <w:lvlText w:val="%9."/>
+      <w:lvlJc w:val="left"/>
+      <w:pPr>
+        <w:tabs>
+          <w:tab w:val="num" w:pos="6480"/>
+        </w:tabs>
+        <w:ind w:left="6480" w:hanging="360"/>
+      </w:pPr>
+    </w:lvl>
+  </w:abstractNum>
+  <w:abstractNum w:abstractNumId="22" w15:restartNumberingAfterBreak="0">
     <w:nsid w:val="34AA08E8"/>
     <w:multiLevelType w:val="hybridMultilevel"/>
     <w:tmpl w:val="CFF0A9F0"/>
@@ -27800,7 +29632,7 @@
       </w:rPr>
     </w:lvl>
   </w:abstractNum>
-  <w:abstractNum w:abstractNumId="20" w15:restartNumberingAfterBreak="0">
+  <w:abstractNum w:abstractNumId="23" w15:restartNumberingAfterBreak="0">
     <w:nsid w:val="3A504AE7"/>
     <w:multiLevelType w:val="multilevel"/>
     <w:tmpl w:val="87B00C80"/>
@@ -27911,7 +29743,7 @@
       </w:rPr>
     </w:lvl>
   </w:abstractNum>
-  <w:abstractNum w:abstractNumId="21" w15:restartNumberingAfterBreak="0">
+  <w:abstractNum w:abstractNumId="24" w15:restartNumberingAfterBreak="0">
     <w:nsid w:val="3A8B2F26"/>
     <w:multiLevelType w:val="hybridMultilevel"/>
     <w:tmpl w:val="3C24A7F2"/>
@@ -28000,7 +29832,7 @@
       </w:pPr>
     </w:lvl>
   </w:abstractNum>
-  <w:abstractNum w:abstractNumId="22" w15:restartNumberingAfterBreak="0">
+  <w:abstractNum w:abstractNumId="25" w15:restartNumberingAfterBreak="0">
     <w:nsid w:val="3FE6201A"/>
     <w:multiLevelType w:val="multilevel"/>
     <w:tmpl w:val="04090025"/>
@@ -28095,7 +29927,7 @@
       </w:pPr>
     </w:lvl>
   </w:abstractNum>
-  <w:abstractNum w:abstractNumId="23" w15:restartNumberingAfterBreak="0">
+  <w:abstractNum w:abstractNumId="26" w15:restartNumberingAfterBreak="0">
     <w:nsid w:val="3FF717E0"/>
     <w:multiLevelType w:val="multilevel"/>
     <w:tmpl w:val="2926E348"/>
@@ -28244,7 +30076,7 @@
       </w:rPr>
     </w:lvl>
   </w:abstractNum>
-  <w:abstractNum w:abstractNumId="24" w15:restartNumberingAfterBreak="0">
+  <w:abstractNum w:abstractNumId="27" w15:restartNumberingAfterBreak="0">
     <w:nsid w:val="414B1498"/>
     <w:multiLevelType w:val="hybridMultilevel"/>
     <w:tmpl w:val="9B70C07A"/>
@@ -28357,7 +30189,7 @@
       </w:rPr>
     </w:lvl>
   </w:abstractNum>
-  <w:abstractNum w:abstractNumId="25" w15:restartNumberingAfterBreak="0">
+  <w:abstractNum w:abstractNumId="28" w15:restartNumberingAfterBreak="0">
     <w:nsid w:val="43BC4B02"/>
     <w:multiLevelType w:val="multilevel"/>
     <w:tmpl w:val="F9B2DC08"/>
@@ -28477,7 +30309,7 @@
       </w:rPr>
     </w:lvl>
   </w:abstractNum>
-  <w:abstractNum w:abstractNumId="26" w15:restartNumberingAfterBreak="0">
+  <w:abstractNum w:abstractNumId="29" w15:restartNumberingAfterBreak="0">
     <w:nsid w:val="441B7522"/>
     <w:multiLevelType w:val="multilevel"/>
     <w:tmpl w:val="BEA43A1C"/>
@@ -28626,7 +30458,156 @@
       </w:rPr>
     </w:lvl>
   </w:abstractNum>
-  <w:abstractNum w:abstractNumId="27" w15:restartNumberingAfterBreak="0">
+  <w:abstractNum w:abstractNumId="30" w15:restartNumberingAfterBreak="0">
+    <w:nsid w:val="47B64D27"/>
+    <w:multiLevelType w:val="multilevel"/>
+    <w:tmpl w:val="0B668A94"/>
+    <w:lvl w:ilvl="0">
+      <w:start w:val="1"/>
+      <w:numFmt w:val="bullet"/>
+      <w:lvlText w:val=""/>
+      <w:lvlJc w:val="left"/>
+      <w:pPr>
+        <w:tabs>
+          <w:tab w:val="num" w:pos="720"/>
+        </w:tabs>
+        <w:ind w:left="720" w:hanging="360"/>
+      </w:pPr>
+      <w:rPr>
+        <w:rFonts w:ascii="Symbol" w:hAnsi="Symbol" w:hint="default"/>
+        <w:sz w:val="20"/>
+      </w:rPr>
+    </w:lvl>
+    <w:lvl w:ilvl="1">
+      <w:start w:val="1"/>
+      <w:numFmt w:val="bullet"/>
+      <w:lvlText w:val=""/>
+      <w:lvlJc w:val="left"/>
+      <w:pPr>
+        <w:tabs>
+          <w:tab w:val="num" w:pos="1440"/>
+        </w:tabs>
+        <w:ind w:left="1440" w:hanging="360"/>
+      </w:pPr>
+      <w:rPr>
+        <w:rFonts w:ascii="Symbol" w:hAnsi="Symbol" w:hint="default"/>
+        <w:sz w:val="20"/>
+      </w:rPr>
+    </w:lvl>
+    <w:lvl w:ilvl="2">
+      <w:start w:val="1"/>
+      <w:numFmt w:val="bullet"/>
+      <w:lvlText w:val=""/>
+      <w:lvlJc w:val="left"/>
+      <w:pPr>
+        <w:tabs>
+          <w:tab w:val="num" w:pos="2160"/>
+        </w:tabs>
+        <w:ind w:left="2160" w:hanging="360"/>
+      </w:pPr>
+      <w:rPr>
+        <w:rFonts w:ascii="Symbol" w:hAnsi="Symbol" w:hint="default"/>
+        <w:sz w:val="20"/>
+      </w:rPr>
+    </w:lvl>
+    <w:lvl w:ilvl="3">
+      <w:start w:val="1"/>
+      <w:numFmt w:val="bullet"/>
+      <w:lvlText w:val=""/>
+      <w:lvlJc w:val="left"/>
+      <w:pPr>
+        <w:tabs>
+          <w:tab w:val="num" w:pos="2880"/>
+        </w:tabs>
+        <w:ind w:left="2880" w:hanging="360"/>
+      </w:pPr>
+      <w:rPr>
+        <w:rFonts w:ascii="Symbol" w:hAnsi="Symbol" w:hint="default"/>
+        <w:sz w:val="20"/>
+      </w:rPr>
+    </w:lvl>
+    <w:lvl w:ilvl="4" w:tentative="1">
+      <w:start w:val="1"/>
+      <w:numFmt w:val="bullet"/>
+      <w:lvlText w:val=""/>
+      <w:lvlJc w:val="left"/>
+      <w:pPr>
+        <w:tabs>
+          <w:tab w:val="num" w:pos="3600"/>
+        </w:tabs>
+        <w:ind w:left="3600" w:hanging="360"/>
+      </w:pPr>
+      <w:rPr>
+        <w:rFonts w:ascii="Symbol" w:hAnsi="Symbol" w:hint="default"/>
+        <w:sz w:val="20"/>
+      </w:rPr>
+    </w:lvl>
+    <w:lvl w:ilvl="5" w:tentative="1">
+      <w:start w:val="1"/>
+      <w:numFmt w:val="bullet"/>
+      <w:lvlText w:val=""/>
+      <w:lvlJc w:val="left"/>
+      <w:pPr>
+        <w:tabs>
+          <w:tab w:val="num" w:pos="4320"/>
+        </w:tabs>
+        <w:ind w:left="4320" w:hanging="360"/>
+      </w:pPr>
+      <w:rPr>
+        <w:rFonts w:ascii="Symbol" w:hAnsi="Symbol" w:hint="default"/>
+        <w:sz w:val="20"/>
+      </w:rPr>
+    </w:lvl>
+    <w:lvl w:ilvl="6" w:tentative="1">
+      <w:start w:val="1"/>
+      <w:numFmt w:val="bullet"/>
+      <w:lvlText w:val=""/>
+      <w:lvlJc w:val="left"/>
+      <w:pPr>
+        <w:tabs>
+          <w:tab w:val="num" w:pos="5040"/>
+        </w:tabs>
+        <w:ind w:left="5040" w:hanging="360"/>
+      </w:pPr>
+      <w:rPr>
+        <w:rFonts w:ascii="Symbol" w:hAnsi="Symbol" w:hint="default"/>
+        <w:sz w:val="20"/>
+      </w:rPr>
+    </w:lvl>
+    <w:lvl w:ilvl="7" w:tentative="1">
+      <w:start w:val="1"/>
+      <w:numFmt w:val="bullet"/>
+      <w:lvlText w:val=""/>
+      <w:lvlJc w:val="left"/>
+      <w:pPr>
+        <w:tabs>
+          <w:tab w:val="num" w:pos="5760"/>
+        </w:tabs>
+        <w:ind w:left="5760" w:hanging="360"/>
+      </w:pPr>
+      <w:rPr>
+        <w:rFonts w:ascii="Symbol" w:hAnsi="Symbol" w:hint="default"/>
+        <w:sz w:val="20"/>
+      </w:rPr>
+    </w:lvl>
+    <w:lvl w:ilvl="8" w:tentative="1">
+      <w:start w:val="1"/>
+      <w:numFmt w:val="bullet"/>
+      <w:lvlText w:val=""/>
+      <w:lvlJc w:val="left"/>
+      <w:pPr>
+        <w:tabs>
+          <w:tab w:val="num" w:pos="6480"/>
+        </w:tabs>
+        <w:ind w:left="6480" w:hanging="360"/>
+      </w:pPr>
+      <w:rPr>
+        <w:rFonts w:ascii="Symbol" w:hAnsi="Symbol" w:hint="default"/>
+        <w:sz w:val="20"/>
+      </w:rPr>
+    </w:lvl>
+  </w:abstractNum>
+  <w:abstractNum w:abstractNumId="31" w15:restartNumberingAfterBreak="0">
     <w:nsid w:val="48CC7115"/>
     <w:multiLevelType w:val="multilevel"/>
     <w:tmpl w:val="EBA4937C"/>
@@ -28775,7 +30756,7 @@
       </w:rPr>
     </w:lvl>
   </w:abstractNum>
-  <w:abstractNum w:abstractNumId="28" w15:restartNumberingAfterBreak="0">
+  <w:abstractNum w:abstractNumId="32" w15:restartNumberingAfterBreak="0">
     <w:nsid w:val="4DE04931"/>
     <w:multiLevelType w:val="multilevel"/>
     <w:tmpl w:val="87B00C80"/>
@@ -28885,7 +30866,7 @@
       </w:rPr>
     </w:lvl>
   </w:abstractNum>
-  <w:abstractNum w:abstractNumId="29" w15:restartNumberingAfterBreak="0">
+  <w:abstractNum w:abstractNumId="33" w15:restartNumberingAfterBreak="0">
     <w:nsid w:val="53867856"/>
     <w:multiLevelType w:val="hybridMultilevel"/>
     <w:tmpl w:val="73367A94"/>
@@ -28998,7 +30979,7 @@
       </w:rPr>
     </w:lvl>
   </w:abstractNum>
-  <w:abstractNum w:abstractNumId="30" w15:restartNumberingAfterBreak="0">
+  <w:abstractNum w:abstractNumId="34" w15:restartNumberingAfterBreak="0">
     <w:nsid w:val="56D5786E"/>
     <w:multiLevelType w:val="multilevel"/>
     <w:tmpl w:val="B9F232FE"/>
@@ -29147,7 +31128,7 @@
       </w:rPr>
     </w:lvl>
   </w:abstractNum>
-  <w:abstractNum w:abstractNumId="31" w15:restartNumberingAfterBreak="0">
+  <w:abstractNum w:abstractNumId="35" w15:restartNumberingAfterBreak="0">
     <w:nsid w:val="599D3050"/>
     <w:multiLevelType w:val="hybridMultilevel"/>
     <w:tmpl w:val="5DC60DC2"/>
@@ -29260,7 +31241,7 @@
       </w:rPr>
     </w:lvl>
   </w:abstractNum>
-  <w:abstractNum w:abstractNumId="32" w15:restartNumberingAfterBreak="0">
+  <w:abstractNum w:abstractNumId="36" w15:restartNumberingAfterBreak="0">
     <w:nsid w:val="5AB62E9D"/>
     <w:multiLevelType w:val="multilevel"/>
     <w:tmpl w:val="4AC01EC8"/>
@@ -29409,7 +31390,7 @@
       </w:rPr>
     </w:lvl>
   </w:abstractNum>
-  <w:abstractNum w:abstractNumId="33" w15:restartNumberingAfterBreak="0">
+  <w:abstractNum w:abstractNumId="37" w15:restartNumberingAfterBreak="0">
     <w:nsid w:val="5B3126B9"/>
     <w:multiLevelType w:val="multilevel"/>
     <w:tmpl w:val="64602E4A"/>
@@ -29558,7 +31539,7 @@
       </w:rPr>
     </w:lvl>
   </w:abstractNum>
-  <w:abstractNum w:abstractNumId="34" w15:restartNumberingAfterBreak="0">
+  <w:abstractNum w:abstractNumId="38" w15:restartNumberingAfterBreak="0">
     <w:nsid w:val="5BD96947"/>
     <w:multiLevelType w:val="multilevel"/>
     <w:tmpl w:val="10BC7A8E"/>
@@ -29707,7 +31688,93 @@
       </w:rPr>
     </w:lvl>
   </w:abstractNum>
-  <w:abstractNum w:abstractNumId="35" w15:restartNumberingAfterBreak="0">
+  <w:abstractNum w:abstractNumId="39" w15:restartNumberingAfterBreak="0">
+    <w:nsid w:val="5CCA698D"/>
+    <w:multiLevelType w:val="hybridMultilevel"/>
+    <w:tmpl w:val="42CE67D0"/>
+    <w:lvl w:ilvl="0" w:tplc="0409000F">
+      <w:start w:val="1"/>
+      <w:numFmt w:val="decimal"/>
+      <w:lvlText w:val="%1."/>
+      <w:lvlJc w:val="left"/>
+      <w:pPr>
+        <w:ind w:left="720" w:hanging="360"/>
+      </w:pPr>
+    </w:lvl>
+    <w:lvl w:ilvl="1" w:tplc="04090019" w:tentative="1">
+      <w:start w:val="1"/>
+      <w:numFmt w:val="lowerLetter"/>
+      <w:lvlText w:val="%2."/>
+      <w:lvlJc w:val="left"/>
+      <w:pPr>
+        <w:ind w:left="1440" w:hanging="360"/>
+      </w:pPr>
+    </w:lvl>
+    <w:lvl w:ilvl="2" w:tplc="0409001B" w:tentative="1">
+      <w:start w:val="1"/>
+      <w:numFmt w:val="lowerRoman"/>
+      <w:lvlText w:val="%3."/>
+      <w:lvlJc w:val="right"/>
+      <w:pPr>
+        <w:ind w:left="2160" w:hanging="180"/>
+      </w:pPr>
+    </w:lvl>
+    <w:lvl w:ilvl="3" w:tplc="0409000F" w:tentative="1">
+      <w:start w:val="1"/>
+      <w:numFmt w:val="decimal"/>
+      <w:lvlText w:val="%4."/>
+      <w:lvlJc w:val="left"/>
+      <w:pPr>
+        <w:ind w:left="2880" w:hanging="360"/>
+      </w:pPr>
+    </w:lvl>
+    <w:lvl w:ilvl="4" w:tplc="04090019" w:tentative="1">
+      <w:start w:val="1"/>
+      <w:numFmt w:val="lowerLetter"/>
+      <w:lvlText w:val="%5."/>
+      <w:lvlJc w:val="left"/>
+      <w:pPr>
+        <w:ind w:left="3600" w:hanging="360"/>
+      </w:pPr>
+    </w:lvl>
+    <w:lvl w:ilvl="5" w:tplc="0409001B" w:tentative="1">
+      <w:start w:val="1"/>
+      <w:numFmt w:val="lowerRoman"/>
+      <w:lvlText w:val="%6."/>
+      <w:lvlJc w:val="right"/>
+      <w:pPr>
+        <w:ind w:left="4320" w:hanging="180"/>
+      </w:pPr>
+    </w:lvl>
+    <w:lvl w:ilvl="6" w:tplc="0409000F" w:tentative="1">
+      <w:start w:val="1"/>
+      <w:numFmt w:val="decimal"/>
+      <w:lvlText w:val="%7."/>
+      <w:lvlJc w:val="left"/>
+      <w:pPr>
+        <w:ind w:left="5040" w:hanging="360"/>
+      </w:pPr>
+    </w:lvl>
+    <w:lvl w:ilvl="7" w:tplc="04090019" w:tentative="1">
+      <w:start w:val="1"/>
+      <w:numFmt w:val="lowerLetter"/>
+      <w:lvlText w:val="%8."/>
+      <w:lvlJc w:val="left"/>
+      <w:pPr>
+        <w:ind w:left="5760" w:hanging="360"/>
+      </w:pPr>
+    </w:lvl>
+    <w:lvl w:ilvl="8" w:tplc="0409001B" w:tentative="1">
+      <w:start w:val="1"/>
+      <w:numFmt w:val="lowerRoman"/>
+      <w:lvlText w:val="%9."/>
+      <w:lvlJc w:val="right"/>
+      <w:pPr>
+        <w:ind w:left="6480" w:hanging="180"/>
+      </w:pPr>
+    </w:lvl>
+  </w:abstractNum>
+  <w:abstractNum w:abstractNumId="40" w15:restartNumberingAfterBreak="0">
     <w:nsid w:val="5CD75B87"/>
     <w:multiLevelType w:val="hybridMultilevel"/>
     <w:tmpl w:val="23AE42B4"/>
@@ -29820,7 +31887,7 @@
       </w:rPr>
     </w:lvl>
   </w:abstractNum>
-  <w:abstractNum w:abstractNumId="36" w15:restartNumberingAfterBreak="0">
+  <w:abstractNum w:abstractNumId="41" w15:restartNumberingAfterBreak="0">
     <w:nsid w:val="5D99751D"/>
     <w:multiLevelType w:val="hybridMultilevel"/>
     <w:tmpl w:val="ADD2CDE8"/>
@@ -29933,7 +32000,7 @@
       </w:rPr>
     </w:lvl>
   </w:abstractNum>
-  <w:abstractNum w:abstractNumId="37" w15:restartNumberingAfterBreak="0">
+  <w:abstractNum w:abstractNumId="42" w15:restartNumberingAfterBreak="0">
     <w:nsid w:val="62017C1D"/>
     <w:multiLevelType w:val="multilevel"/>
     <w:tmpl w:val="71B8343E"/>
@@ -30082,7 +32149,7 @@
       </w:rPr>
     </w:lvl>
   </w:abstractNum>
-  <w:abstractNum w:abstractNumId="38" w15:restartNumberingAfterBreak="0">
+  <w:abstractNum w:abstractNumId="43" w15:restartNumberingAfterBreak="0">
     <w:nsid w:val="6206480E"/>
     <w:multiLevelType w:val="multilevel"/>
     <w:tmpl w:val="F2AA16C0"/>
@@ -30195,7 +32262,7 @@
       </w:pPr>
     </w:lvl>
   </w:abstractNum>
-  <w:abstractNum w:abstractNumId="39" w15:restartNumberingAfterBreak="0">
+  <w:abstractNum w:abstractNumId="44" w15:restartNumberingAfterBreak="0">
     <w:nsid w:val="6509635A"/>
     <w:multiLevelType w:val="multilevel"/>
     <w:tmpl w:val="8EF02D2C"/>
@@ -30344,7 +32411,7 @@
       </w:rPr>
     </w:lvl>
   </w:abstractNum>
-  <w:abstractNum w:abstractNumId="40" w15:restartNumberingAfterBreak="0">
+  <w:abstractNum w:abstractNumId="45" w15:restartNumberingAfterBreak="0">
     <w:nsid w:val="669C4869"/>
     <w:multiLevelType w:val="multilevel"/>
     <w:tmpl w:val="321016AA"/>
@@ -30493,7 +32560,124 @@
       </w:rPr>
     </w:lvl>
   </w:abstractNum>
-  <w:abstractNum w:abstractNumId="41" w15:restartNumberingAfterBreak="0">
+  <w:abstractNum w:abstractNumId="46" w15:restartNumberingAfterBreak="0">
+    <w:nsid w:val="693C6229"/>
+    <w:multiLevelType w:val="multilevel"/>
+    <w:tmpl w:val="2CD090B0"/>
+    <w:lvl w:ilvl="0">
+      <w:start w:val="1"/>
+      <w:numFmt w:val="decimal"/>
+      <w:lvlText w:val="%1."/>
+      <w:lvlJc w:val="left"/>
+      <w:pPr>
+        <w:tabs>
+          <w:tab w:val="num" w:pos="360"/>
+        </w:tabs>
+        <w:ind w:left="360" w:hanging="360"/>
+      </w:pPr>
+    </w:lvl>
+    <w:lvl w:ilvl="1">
+      <w:start w:val="1"/>
+      <w:numFmt w:val="bullet"/>
+      <w:lvlText w:val=""/>
+      <w:lvlJc w:val="left"/>
+      <w:pPr>
+        <w:tabs>
+          <w:tab w:val="num" w:pos="1080"/>
+        </w:tabs>
+        <w:ind w:left="1080" w:hanging="360"/>
+      </w:pPr>
+      <w:rPr>
+        <w:rFonts w:ascii="Symbol" w:hAnsi="Symbol" w:hint="default"/>
+        <w:sz w:val="20"/>
+      </w:rPr>
+    </w:lvl>
+    <w:lvl w:ilvl="2" w:tentative="1">
+      <w:start w:val="1"/>
+      <w:numFmt w:val="decimal"/>
+      <w:lvlText w:val="%3."/>
+      <w:lvlJc w:val="left"/>
+      <w:pPr>
+        <w:tabs>
+          <w:tab w:val="num" w:pos="1800"/>
+        </w:tabs>
+        <w:ind w:left="1800" w:hanging="360"/>
+      </w:pPr>
+    </w:lvl>
+    <w:lvl w:ilvl="3" w:tentative="1">
+      <w:start w:val="1"/>
+      <w:numFmt w:val="decimal"/>
+      <w:lvlText w:val="%4."/>
+      <w:lvlJc w:val="left"/>
+      <w:pPr>
+        <w:tabs>
+          <w:tab w:val="num" w:pos="2520"/>
+        </w:tabs>
+        <w:ind w:left="2520" w:hanging="360"/>
+      </w:pPr>
+    </w:lvl>
+    <w:lvl w:ilvl="4" w:tentative="1">
+      <w:start w:val="1"/>
+      <w:numFmt w:val="decimal"/>
+      <w:lvlText w:val="%5."/>
+      <w:lvlJc w:val="left"/>
+      <w:pPr>
+        <w:tabs>
+          <w:tab w:val="num" w:pos="3240"/>
+        </w:tabs>
+        <w:ind w:left="3240" w:hanging="360"/>
+      </w:pPr>
+    </w:lvl>
+    <w:lvl w:ilvl="5" w:tentative="1">
+      <w:start w:val="1"/>
+      <w:numFmt w:val="decimal"/>
+      <w:lvlText w:val="%6."/>
+      <w:lvlJc w:val="left"/>
+      <w:pPr>
+        <w:tabs>
+          <w:tab w:val="num" w:pos="3960"/>
+        </w:tabs>
+        <w:ind w:left="3960" w:hanging="360"/>
+      </w:pPr>
+    </w:lvl>
+    <w:lvl w:ilvl="6" w:tentative="1">
+      <w:start w:val="1"/>
+      <w:numFmt w:val="decimal"/>
+      <w:lvlText w:val="%7."/>
+      <w:lvlJc w:val="left"/>
+      <w:pPr>
+        <w:tabs>
+          <w:tab w:val="num" w:pos="4680"/>
+        </w:tabs>
+        <w:ind w:left="4680" w:hanging="360"/>
+      </w:pPr>
+    </w:lvl>
+    <w:lvl w:ilvl="7" w:tentative="1">
+      <w:start w:val="1"/>
+      <w:numFmt w:val="decimal"/>
+      <w:lvlText w:val="%8."/>
+      <w:lvlJc w:val="left"/>
+      <w:pPr>
+        <w:tabs>
+          <w:tab w:val="num" w:pos="5400"/>
+        </w:tabs>
+        <w:ind w:left="5400" w:hanging="360"/>
+      </w:pPr>
+    </w:lvl>
+    <w:lvl w:ilvl="8" w:tentative="1">
+      <w:start w:val="1"/>
+      <w:numFmt w:val="decimal"/>
+      <w:lvlText w:val="%9."/>
+      <w:lvlJc w:val="left"/>
+      <w:pPr>
+        <w:tabs>
+          <w:tab w:val="num" w:pos="6120"/>
+        </w:tabs>
+        <w:ind w:left="6120" w:hanging="360"/>
+      </w:pPr>
+    </w:lvl>
+  </w:abstractNum>
+  <w:abstractNum w:abstractNumId="47" w15:restartNumberingAfterBreak="0">
     <w:nsid w:val="6B8E045B"/>
     <w:multiLevelType w:val="hybridMultilevel"/>
     <w:tmpl w:val="B324F59E"/>
@@ -30606,7 +32790,7 @@
       </w:rPr>
     </w:lvl>
   </w:abstractNum>
-  <w:abstractNum w:abstractNumId="42" w15:restartNumberingAfterBreak="0">
+  <w:abstractNum w:abstractNumId="48" w15:restartNumberingAfterBreak="0">
     <w:nsid w:val="6EA02E33"/>
     <w:multiLevelType w:val="multilevel"/>
     <w:tmpl w:val="29225596"/>
@@ -30755,7 +32939,7 @@
       </w:rPr>
     </w:lvl>
   </w:abstractNum>
-  <w:abstractNum w:abstractNumId="43" w15:restartNumberingAfterBreak="0">
+  <w:abstractNum w:abstractNumId="49" w15:restartNumberingAfterBreak="0">
     <w:nsid w:val="6FFF69F9"/>
     <w:multiLevelType w:val="multilevel"/>
     <w:tmpl w:val="9CF4D066"/>
@@ -30904,7 +33088,7 @@
       </w:rPr>
     </w:lvl>
   </w:abstractNum>
-  <w:abstractNum w:abstractNumId="44" w15:restartNumberingAfterBreak="0">
+  <w:abstractNum w:abstractNumId="50" w15:restartNumberingAfterBreak="0">
     <w:nsid w:val="718E260B"/>
     <w:multiLevelType w:val="multilevel"/>
     <w:tmpl w:val="69EC1850"/>
@@ -31053,7 +33237,7 @@
       </w:rPr>
     </w:lvl>
   </w:abstractNum>
-  <w:abstractNum w:abstractNumId="45" w15:restartNumberingAfterBreak="0">
+  <w:abstractNum w:abstractNumId="51" w15:restartNumberingAfterBreak="0">
     <w:nsid w:val="74397121"/>
     <w:multiLevelType w:val="hybridMultilevel"/>
     <w:tmpl w:val="EC26EC00"/>
@@ -31166,7 +33350,7 @@
       </w:rPr>
     </w:lvl>
   </w:abstractNum>
-  <w:abstractNum w:abstractNumId="46" w15:restartNumberingAfterBreak="0">
+  <w:abstractNum w:abstractNumId="52" w15:restartNumberingAfterBreak="0">
     <w:nsid w:val="749A0CBF"/>
     <w:multiLevelType w:val="multilevel"/>
     <w:tmpl w:val="5F829C9A"/>
@@ -31315,7 +33499,7 @@
       </w:rPr>
     </w:lvl>
   </w:abstractNum>
-  <w:abstractNum w:abstractNumId="47" w15:restartNumberingAfterBreak="0">
+  <w:abstractNum w:abstractNumId="53" w15:restartNumberingAfterBreak="0">
     <w:nsid w:val="768B7C3C"/>
     <w:multiLevelType w:val="multilevel"/>
     <w:tmpl w:val="9DE2868C"/>
@@ -31464,7 +33648,7 @@
       </w:rPr>
     </w:lvl>
   </w:abstractNum>
-  <w:abstractNum w:abstractNumId="48" w15:restartNumberingAfterBreak="0">
+  <w:abstractNum w:abstractNumId="54" w15:restartNumberingAfterBreak="0">
     <w:nsid w:val="776824D3"/>
     <w:multiLevelType w:val="hybridMultilevel"/>
     <w:tmpl w:val="B816C90A"/>
@@ -31577,7 +33761,7 @@
       </w:rPr>
     </w:lvl>
   </w:abstractNum>
-  <w:abstractNum w:abstractNumId="49" w15:restartNumberingAfterBreak="0">
+  <w:abstractNum w:abstractNumId="55" w15:restartNumberingAfterBreak="0">
     <w:nsid w:val="78DD0F00"/>
     <w:multiLevelType w:val="multilevel"/>
     <w:tmpl w:val="590EF516"/>
@@ -31726,7 +33910,7 @@
       </w:rPr>
     </w:lvl>
   </w:abstractNum>
-  <w:abstractNum w:abstractNumId="50" w15:restartNumberingAfterBreak="0">
+  <w:abstractNum w:abstractNumId="56" w15:restartNumberingAfterBreak="0">
     <w:nsid w:val="7BDA35DF"/>
     <w:multiLevelType w:val="hybridMultilevel"/>
     <w:tmpl w:val="6FB4A514"/>
@@ -31840,25 +34024,25 @@
     </w:lvl>
   </w:abstractNum>
   <w:num w:numId="1" w16cid:durableId="1840078633">
+    <w:abstractNumId w:val="25"/>
+  </w:num>
+  <w:num w:numId="2" w16cid:durableId="554701382">
+    <w:abstractNumId w:val="51"/>
+  </w:num>
+  <w:num w:numId="3" w16cid:durableId="364991685">
+    <w:abstractNumId w:val="56"/>
+  </w:num>
+  <w:num w:numId="4" w16cid:durableId="1960647871">
+    <w:abstractNumId w:val="32"/>
+  </w:num>
+  <w:num w:numId="5" w16cid:durableId="2007323797">
+    <w:abstractNumId w:val="18"/>
+  </w:num>
+  <w:num w:numId="6" w16cid:durableId="109319944">
     <w:abstractNumId w:val="22"/>
   </w:num>
-  <w:num w:numId="2" w16cid:durableId="554701382">
-    <w:abstractNumId w:val="45"/>
-  </w:num>
-  <w:num w:numId="3" w16cid:durableId="364991685">
-    <w:abstractNumId w:val="50"/>
-  </w:num>
-  <w:num w:numId="4" w16cid:durableId="1960647871">
-    <w:abstractNumId w:val="28"/>
-  </w:num>
-  <w:num w:numId="5" w16cid:durableId="2007323797">
-    <w:abstractNumId w:val="16"/>
-  </w:num>
-  <w:num w:numId="6" w16cid:durableId="109319944">
-    <w:abstractNumId w:val="19"/>
-  </w:num>
   <w:num w:numId="7" w16cid:durableId="1177580442">
-    <w:abstractNumId w:val="21"/>
+    <w:abstractNumId w:val="24"/>
   </w:num>
   <w:num w:numId="8" w16cid:durableId="8068277">
     <w:abstractNumId w:val="1"/>
@@ -31867,7 +34051,7 @@
     <w:abstractNumId w:val="7"/>
   </w:num>
   <w:num w:numId="10" w16cid:durableId="1390417860">
-    <w:abstractNumId w:val="41"/>
+    <w:abstractNumId w:val="47"/>
   </w:num>
   <w:num w:numId="11" w16cid:durableId="1835755129">
     <w:abstractNumId w:val="4"/>
@@ -31876,28 +34060,28 @@
     <w:abstractNumId w:val="3"/>
   </w:num>
   <w:num w:numId="13" w16cid:durableId="1031154129">
+    <w:abstractNumId w:val="23"/>
+  </w:num>
+  <w:num w:numId="14" w16cid:durableId="1240361685">
     <w:abstractNumId w:val="20"/>
   </w:num>
-  <w:num w:numId="14" w16cid:durableId="1240361685">
-    <w:abstractNumId w:val="18"/>
-  </w:num>
   <w:num w:numId="15" w16cid:durableId="474377180">
-    <w:abstractNumId w:val="47"/>
+    <w:abstractNumId w:val="53"/>
   </w:num>
   <w:num w:numId="16" w16cid:durableId="161821712">
-    <w:abstractNumId w:val="48"/>
+    <w:abstractNumId w:val="54"/>
   </w:num>
   <w:num w:numId="17" w16cid:durableId="2146266633">
-    <w:abstractNumId w:val="32"/>
+    <w:abstractNumId w:val="36"/>
   </w:num>
   <w:num w:numId="18" w16cid:durableId="1232933179">
     <w:abstractNumId w:val="2"/>
   </w:num>
   <w:num w:numId="19" w16cid:durableId="1987733086">
-    <w:abstractNumId w:val="23"/>
+    <w:abstractNumId w:val="26"/>
   </w:num>
   <w:num w:numId="20" w16cid:durableId="1500541437">
-    <w:abstractNumId w:val="22"/>
+    <w:abstractNumId w:val="25"/>
   </w:num>
   <w:num w:numId="21" w16cid:durableId="1831553976">
     <w:abstractNumId w:val="5"/>
@@ -31909,91 +34093,109 @@
     <w:abstractNumId w:val="13"/>
   </w:num>
   <w:num w:numId="24" w16cid:durableId="1124663376">
-    <w:abstractNumId w:val="15"/>
+    <w:abstractNumId w:val="16"/>
   </w:num>
   <w:num w:numId="25" w16cid:durableId="198319805">
-    <w:abstractNumId w:val="14"/>
+    <w:abstractNumId w:val="15"/>
   </w:num>
   <w:num w:numId="26" w16cid:durableId="500858240">
     <w:abstractNumId w:val="0"/>
   </w:num>
   <w:num w:numId="27" w16cid:durableId="940649125">
-    <w:abstractNumId w:val="46"/>
+    <w:abstractNumId w:val="52"/>
   </w:num>
   <w:num w:numId="28" w16cid:durableId="1793088598">
-    <w:abstractNumId w:val="49"/>
+    <w:abstractNumId w:val="55"/>
   </w:num>
   <w:num w:numId="29" w16cid:durableId="75515887">
-    <w:abstractNumId w:val="36"/>
+    <w:abstractNumId w:val="41"/>
   </w:num>
   <w:num w:numId="30" w16cid:durableId="1282760617">
     <w:abstractNumId w:val="8"/>
   </w:num>
   <w:num w:numId="31" w16cid:durableId="319383353">
-    <w:abstractNumId w:val="29"/>
+    <w:abstractNumId w:val="33"/>
   </w:num>
   <w:num w:numId="32" w16cid:durableId="117724458">
-    <w:abstractNumId w:val="44"/>
+    <w:abstractNumId w:val="50"/>
   </w:num>
   <w:num w:numId="33" w16cid:durableId="1391003267">
-    <w:abstractNumId w:val="27"/>
+    <w:abstractNumId w:val="31"/>
   </w:num>
   <w:num w:numId="34" w16cid:durableId="1142502424">
     <w:abstractNumId w:val="10"/>
   </w:num>
   <w:num w:numId="35" w16cid:durableId="1816920262">
-    <w:abstractNumId w:val="35"/>
+    <w:abstractNumId w:val="40"/>
   </w:num>
   <w:num w:numId="36" w16cid:durableId="867257023">
-    <w:abstractNumId w:val="24"/>
+    <w:abstractNumId w:val="27"/>
   </w:num>
   <w:num w:numId="37" w16cid:durableId="487333573">
     <w:abstractNumId w:val="9"/>
   </w:num>
   <w:num w:numId="38" w16cid:durableId="569004496">
-    <w:abstractNumId w:val="38"/>
+    <w:abstractNumId w:val="43"/>
   </w:num>
   <w:num w:numId="39" w16cid:durableId="1820917889">
-    <w:abstractNumId w:val="40"/>
+    <w:abstractNumId w:val="45"/>
   </w:num>
   <w:num w:numId="40" w16cid:durableId="1722704636">
-    <w:abstractNumId w:val="26"/>
+    <w:abstractNumId w:val="29"/>
   </w:num>
   <w:num w:numId="41" w16cid:durableId="799031191">
     <w:abstractNumId w:val="12"/>
   </w:num>
   <w:num w:numId="42" w16cid:durableId="1157187515">
-    <w:abstractNumId w:val="30"/>
+    <w:abstractNumId w:val="34"/>
   </w:num>
   <w:num w:numId="43" w16cid:durableId="1543470835">
-    <w:abstractNumId w:val="25"/>
+    <w:abstractNumId w:val="28"/>
   </w:num>
   <w:num w:numId="44" w16cid:durableId="1697534800">
-    <w:abstractNumId w:val="31"/>
+    <w:abstractNumId w:val="35"/>
   </w:num>
   <w:num w:numId="45" w16cid:durableId="1701852509">
-    <w:abstractNumId w:val="17"/>
+    <w:abstractNumId w:val="19"/>
   </w:num>
   <w:num w:numId="46" w16cid:durableId="1535147715">
-    <w:abstractNumId w:val="37"/>
+    <w:abstractNumId w:val="42"/>
   </w:num>
   <w:num w:numId="47" w16cid:durableId="1558591130">
-    <w:abstractNumId w:val="42"/>
+    <w:abstractNumId w:val="48"/>
   </w:num>
   <w:num w:numId="48" w16cid:durableId="1858692024">
     <w:abstractNumId w:val="6"/>
   </w:num>
   <w:num w:numId="49" w16cid:durableId="522862188">
+    <w:abstractNumId w:val="44"/>
+  </w:num>
+  <w:num w:numId="50" w16cid:durableId="652416923">
+    <w:abstractNumId w:val="49"/>
+  </w:num>
+  <w:num w:numId="51" w16cid:durableId="208298059">
+    <w:abstractNumId w:val="37"/>
+  </w:num>
+  <w:num w:numId="52" w16cid:durableId="195430189">
+    <w:abstractNumId w:val="38"/>
+  </w:num>
+  <w:num w:numId="53" w16cid:durableId="1406224961">
+    <w:abstractNumId w:val="14"/>
+  </w:num>
+  <w:num w:numId="54" w16cid:durableId="1608810397">
+    <w:abstractNumId w:val="17"/>
+  </w:num>
+  <w:num w:numId="55" w16cid:durableId="1876459096">
     <w:abstractNumId w:val="39"/>
   </w:num>
-  <w:num w:numId="50" w16cid:durableId="652416923">
-    <w:abstractNumId w:val="43"/>
+  <w:num w:numId="56" w16cid:durableId="592780269">
+    <w:abstractNumId w:val="46"/>
   </w:num>
-  <w:num w:numId="51" w16cid:durableId="208298059">
-    <w:abstractNumId w:val="33"/>
+  <w:num w:numId="57" w16cid:durableId="1953634716">
+    <w:abstractNumId w:val="30"/>
   </w:num>
-  <w:num w:numId="52" w16cid:durableId="195430189">
-    <w:abstractNumId w:val="34"/>
+  <w:num w:numId="58" w16cid:durableId="695038223">
+    <w:abstractNumId w:val="21"/>
   </w:num>
   <w:numIdMacAtCleanup w:val="14"/>
 </w:numbering>
@@ -33172,6 +35374,16 @@
       <w:szCs w:val="18"/>
     </w:rPr>
   </w:style>
+  <w:style w:type="character" w:styleId="PlaceholderText">
+    <w:name w:val="Placeholder Text"/>
+    <w:basedOn w:val="DefaultParagraphFont"/>
+    <w:uiPriority w:val="99"/>
+    <w:semiHidden/>
+    <w:rsid w:val="003D22EE"/>
+    <w:rPr>
+      <w:color w:val="666666"/>
+    </w:rPr>
+  </w:style>
 </w:styles>
 </file>
 

</xml_diff>